<commit_message>
1.1-§: Word ochmagan jc="l" xatosi tuzatildi
Co-Authored-By: Claude Opus 5.5 <noreply@anthropic.com>
Claude-Session: https://claude.ai/code/session_01PxHTC8Q7yHdrpAeUA5KUgM
</commit_message>
<xml_diff>
--- a/paragraflar/1.1-paragraf.docx
+++ b/paragraflar/1.1-paragraf.docx
@@ -3451,7 +3451,7 @@
                             <w:p>
                               <w:pPr>
                                 <w:spacing w:before="0" w:after="0" w:line="228" w:lineRule="auto"/>
-                                <w:jc w:val="l"/>
+                                <w:jc w:val="left"/>
                                 <w:ind w:firstLine="0"/>
                               </w:pPr>
                               <w:r>
@@ -3467,7 +3467,7 @@
                             <w:p>
                               <w:pPr>
                                 <w:spacing w:before="0" w:after="0" w:line="228" w:lineRule="auto"/>
-                                <w:jc w:val="l"/>
+                                <w:jc w:val="left"/>
                                 <w:ind w:firstLine="0"/>
                               </w:pPr>
                               <w:r>
@@ -3483,7 +3483,7 @@
                             <w:p>
                               <w:pPr>
                                 <w:spacing w:before="0" w:after="0" w:line="228" w:lineRule="auto"/>
-                                <w:jc w:val="l"/>
+                                <w:jc w:val="left"/>
                                 <w:ind w:firstLine="0"/>
                               </w:pPr>
                               <w:r>
@@ -3499,7 +3499,7 @@
                             <w:p>
                               <w:pPr>
                                 <w:spacing w:before="0" w:after="0" w:line="228" w:lineRule="auto"/>
-                                <w:jc w:val="l"/>
+                                <w:jc w:val="left"/>
                                 <w:ind w:firstLine="0"/>
                               </w:pPr>
                               <w:r>
@@ -3515,7 +3515,7 @@
                             <w:p>
                               <w:pPr>
                                 <w:spacing w:before="0" w:after="0" w:line="228" w:lineRule="auto"/>
-                                <w:jc w:val="l"/>
+                                <w:jc w:val="left"/>
                                 <w:ind w:firstLine="0"/>
                               </w:pPr>
                               <w:r>
@@ -3531,7 +3531,7 @@
                             <w:p>
                               <w:pPr>
                                 <w:spacing w:before="0" w:after="0" w:line="228" w:lineRule="auto"/>
-                                <w:jc w:val="l"/>
+                                <w:jc w:val="left"/>
                                 <w:ind w:firstLine="0"/>
                               </w:pPr>
                               <w:r>
@@ -3547,7 +3547,7 @@
                             <w:p>
                               <w:pPr>
                                 <w:spacing w:before="0" w:after="0" w:line="228" w:lineRule="auto"/>
-                                <w:jc w:val="l"/>
+                                <w:jc w:val="left"/>
                                 <w:ind w:firstLine="0"/>
                               </w:pPr>
                               <w:r>
@@ -3563,7 +3563,7 @@
                             <w:p>
                               <w:pPr>
                                 <w:spacing w:before="0" w:after="0" w:line="228" w:lineRule="auto"/>
-                                <w:jc w:val="l"/>
+                                <w:jc w:val="left"/>
                                 <w:ind w:firstLine="0"/>
                               </w:pPr>
                               <w:r>
@@ -3579,7 +3579,7 @@
                             <w:p>
                               <w:pPr>
                                 <w:spacing w:before="0" w:after="0" w:line="228" w:lineRule="auto"/>
-                                <w:jc w:val="l"/>
+                                <w:jc w:val="left"/>
                                 <w:ind w:firstLine="0"/>
                               </w:pPr>
                               <w:r>
@@ -3595,7 +3595,7 @@
                             <w:p>
                               <w:pPr>
                                 <w:spacing w:before="0" w:after="0" w:line="228" w:lineRule="auto"/>
-                                <w:jc w:val="l"/>
+                                <w:jc w:val="left"/>
                                 <w:ind w:firstLine="0"/>
                               </w:pPr>
                               <w:r>
@@ -3708,7 +3708,7 @@
                             <w:p>
                               <w:pPr>
                                 <w:spacing w:before="0" w:after="0" w:line="228" w:lineRule="auto"/>
-                                <w:jc w:val="l"/>
+                                <w:jc w:val="left"/>
                                 <w:ind w:firstLine="0"/>
                               </w:pPr>
                               <w:r>
@@ -3724,7 +3724,7 @@
                             <w:p>
                               <w:pPr>
                                 <w:spacing w:before="0" w:after="0" w:line="228" w:lineRule="auto"/>
-                                <w:jc w:val="l"/>
+                                <w:jc w:val="left"/>
                                 <w:ind w:firstLine="0"/>
                               </w:pPr>
                               <w:r>
@@ -3740,7 +3740,7 @@
                             <w:p>
                               <w:pPr>
                                 <w:spacing w:before="0" w:after="0" w:line="228" w:lineRule="auto"/>
-                                <w:jc w:val="l"/>
+                                <w:jc w:val="left"/>
                                 <w:ind w:firstLine="0"/>
                               </w:pPr>
                               <w:r>
@@ -3756,7 +3756,7 @@
                             <w:p>
                               <w:pPr>
                                 <w:spacing w:before="0" w:after="0" w:line="228" w:lineRule="auto"/>
-                                <w:jc w:val="l"/>
+                                <w:jc w:val="left"/>
                                 <w:ind w:firstLine="0"/>
                               </w:pPr>
                               <w:r>
@@ -3772,7 +3772,7 @@
                             <w:p>
                               <w:pPr>
                                 <w:spacing w:before="0" w:after="0" w:line="228" w:lineRule="auto"/>
-                                <w:jc w:val="l"/>
+                                <w:jc w:val="left"/>
                                 <w:ind w:firstLine="0"/>
                               </w:pPr>
                               <w:r>
@@ -3788,7 +3788,7 @@
                             <w:p>
                               <w:pPr>
                                 <w:spacing w:before="0" w:after="0" w:line="228" w:lineRule="auto"/>
-                                <w:jc w:val="l"/>
+                                <w:jc w:val="left"/>
                                 <w:ind w:firstLine="0"/>
                               </w:pPr>
                               <w:r>
@@ -3804,7 +3804,7 @@
                             <w:p>
                               <w:pPr>
                                 <w:spacing w:before="0" w:after="0" w:line="228" w:lineRule="auto"/>
-                                <w:jc w:val="l"/>
+                                <w:jc w:val="left"/>
                                 <w:ind w:firstLine="0"/>
                               </w:pPr>
                               <w:r>
@@ -3820,7 +3820,7 @@
                             <w:p>
                               <w:pPr>
                                 <w:spacing w:before="0" w:after="0" w:line="228" w:lineRule="auto"/>
-                                <w:jc w:val="l"/>
+                                <w:jc w:val="left"/>
                                 <w:ind w:firstLine="0"/>
                               </w:pPr>
                               <w:r>
@@ -3836,7 +3836,7 @@
                             <w:p>
                               <w:pPr>
                                 <w:spacing w:before="0" w:after="0" w:line="228" w:lineRule="auto"/>
-                                <w:jc w:val="l"/>
+                                <w:jc w:val="left"/>
                                 <w:ind w:firstLine="0"/>
                               </w:pPr>
                               <w:r>

</xml_diff>

<commit_message>
Diagrammalar o‘lchami bir xil (16×8 sm) qilindi: 1.1, 1.3, 2.2-§
Co-Authored-By: Claude Opus 5.5 <noreply@anthropic.com>
Claude-Session: https://claude.ai/code/session_01PxHTC8Q7yHdrpAeUA5KUgM
</commit_message>
<xml_diff>
--- a/paragraflar/1.1-paragraf.docx
+++ b/paragraflar/1.1-paragraf.docx
@@ -3929,7 +3929,7 @@
         </w:rPr>
         <w:drawing>
           <wp:inline distT="0" distB="0" distL="0" distR="0">
-            <wp:extent cx="5400000" cy="2700000"/>
+            <wp:extent cx="5760000" cy="2880000"/>
             <wp:effectExtent l="0" t="0" r="0" b="0"/>
             <wp:docPr id="1005" name="1.1.5-rasm"/>
             <wp:cNvGraphicFramePr/>
@@ -4237,7 +4237,7 @@
         </w:rPr>
         <w:drawing>
           <wp:inline distT="0" distB="0" distL="0" distR="0">
-            <wp:extent cx="5400000" cy="2700000"/>
+            <wp:extent cx="5760000" cy="2880000"/>
             <wp:effectExtent l="0" t="0" r="0" b="0"/>
             <wp:docPr id="1006" name="1.1.6-rasm"/>
             <wp:cNvGraphicFramePr/>
@@ -7877,7 +7877,7 @@
         <c:numFmt formatCode="General" sourceLinked="0"/>
         <c:majorTickMark val="none"/>
         <c:minorTickMark val="none"/>
-        <c:tickLblPos val="nextTo"/>
+        <c:tickLblPos val="low"/>
         <c:spPr>
           <a:ln w="9525">
             <a:solidFill>
@@ -8242,7 +8242,7 @@
         <c:numFmt formatCode="General" sourceLinked="0"/>
         <c:majorTickMark val="none"/>
         <c:minorTickMark val="none"/>
-        <c:tickLblPos val="nextTo"/>
+        <c:tickLblPos val="low"/>
         <c:spPr>
           <a:ln w="9525">
             <a:solidFill>

</xml_diff>

<commit_message>
Ustunli diagrammalarda chetki yillar kesilishi tuzatildi (crossBetween=between); barcha diagrammalar 16×8 sm
Co-Authored-By: Claude Opus 5.5 <noreply@anthropic.com>
Claude-Session: https://claude.ai/code/session_01PxHTC8Q7yHdrpAeUA5KUgM
</commit_message>
<xml_diff>
--- a/paragraflar/1.1-paragraf.docx
+++ b/paragraflar/1.1-paragraf.docx
@@ -7984,7 +7984,7 @@
         </c:txPr>
         <c:crossAx val="111"/>
         <c:crosses val="autoZero"/>
-        <c:crossBetween val="midCat"/>
+        <c:crossBetween val="between"/>
         <c:majorUnit val="20"/>
       </c:valAx>
       <c:spPr>
@@ -8349,7 +8349,7 @@
         </c:txPr>
         <c:crossAx val="111"/>
         <c:crosses val="autoZero"/>
-        <c:crossBetween val="midCat"/>
+        <c:crossBetween val="between"/>
         <c:majorUnit val="20"/>
       </c:valAx>
       <c:spPr>

</xml_diff>

<commit_message>
2.2-§: 2.2.1-rasm 2021–2025-yillar (byulleten 5.1.2) bo‘yicha qayta tuzildi, 2.2.3-rasm to‘liq qatorlar bilan; diagrammalarda yillar gorizontal
Co-Authored-By: Claude Opus 5.5 <noreply@anthropic.com>
Claude-Session: https://claude.ai/code/session_01PxHTC8Q7yHdrpAeUA5KUgM
</commit_message>
<xml_diff>
--- a/paragraflar/1.1-paragraf.docx
+++ b/paragraflar/1.1-paragraf.docx
@@ -7886,7 +7886,7 @@
           </a:ln>
         </c:spPr>
         <c:txPr>
-          <a:bodyPr/>
+          <a:bodyPr rot="0" vert="horz"/>
           <a:lstStyle/>
           <a:p>
             <a:pPr>
@@ -7906,6 +7906,7 @@
         <c:auto val="1"/>
         <c:lblAlgn val="ctr"/>
         <c:lblOffset val="100"/>
+        <c:tickLblSkip val="1"/>
         <c:noMultiLvlLbl val="0"/>
       </c:catAx>
       <c:valAx>
@@ -8251,7 +8252,7 @@
           </a:ln>
         </c:spPr>
         <c:txPr>
-          <a:bodyPr/>
+          <a:bodyPr rot="0" vert="horz"/>
           <a:lstStyle/>
           <a:p>
             <a:pPr>
@@ -8271,6 +8272,7 @@
         <c:auto val="1"/>
         <c:lblAlgn val="ctr"/>
         <c:lblOffset val="100"/>
+        <c:tickLblSkip val="1"/>
         <c:noMultiLvlLbl val="0"/>
       </c:catAx>
       <c:valAx>

</xml_diff>

<commit_message>
1.1-§: mahalliy olimlar qarashlari (Sattarov, Bozorov, Sadikov, Madaminov, Abdishukurov) qo‘shildi, ta’riflar jadvali kengaytirildi
Co-Authored-By: Claude Opus 5.5 <noreply@anthropic.com>
Claude-Session: https://claude.ai/code/session_01PxHTC8Q7yHdrpAeUA5KUgM
</commit_message>
<xml_diff>
--- a/paragraflar/1.1-paragraf.docx
+++ b/paragraflar/1.1-paragraf.docx
@@ -2,7 +2,7 @@
 <file path=word/document.xml><?xml version="1.0" encoding="utf-8"?>
 <w:document xmlns:w="http://schemas.openxmlformats.org/wordprocessingml/2006/main" xmlns:m="http://schemas.openxmlformats.org/officeDocument/2006/math" xmlns:r="http://schemas.openxmlformats.org/officeDocument/2006/relationships" xmlns:o="urn:schemas-microsoft-com:office:office" xmlns:v="urn:schemas-microsoft-com:vml" xmlns:w10="urn:schemas-microsoft-com:office:word" xmlns:a="http://schemas.openxmlformats.org/drawingml/2006/main" xmlns:pic="http://schemas.openxmlformats.org/drawingml/2006/picture" xmlns:wp="http://schemas.openxmlformats.org/drawingml/2006/wordprocessingDrawing">
   <w:body>
-    <w:bookmarkStart w:id="63" w:name="X3bc3af2dd64aa3d859b43cc63eba0df007461c7"/>
+    <w:bookmarkStart w:id="68" w:name="X3bc3af2dd64aa3d859b43cc63eba0df007461c7"/>
     <w:p>
       <w:pPr>
         <w:pStyle w:val="Heading2"/>
@@ -1458,6 +1458,183 @@
                 <w:rFonts w:ascii="Times New Roman" w:hAnsi="Times New Roman" w:cs="Times New Roman" w:eastAsia="Times New Roman"/>
                 <w:sz w:val="22"/>
               </w:rPr>
+              <w:t xml:space="preserve">O.B. Sattarov</w:t>
+            </w:r>
+          </w:p>
+        </w:tc>
+        <w:tc>
+          <w:tcPr/>
+          <w:p>
+            <w:pPr>
+              <w:pStyle w:val="Compact"/>
+              <w:spacing w:line="240" w:lineRule="auto"/>
+              <w:ind w:firstLine="0"/>
+              <w:jc w:val="left"/>
+            </w:pPr>
+            <w:r>
+              <w:rPr>
+                <w:rFonts w:ascii="Times New Roman" w:hAnsi="Times New Roman" w:cs="Times New Roman" w:eastAsia="Times New Roman"/>
+                <w:sz w:val="22"/>
+              </w:rPr>
+              <w:t xml:space="preserve">Markaziy bank va tijorat banklari o‘z funksiyalarini to‘laqonli bajara olishini ta’minlaydigan darajani saqlagan holda rivojlanishga intilish (bank tizimi barqarorligi)</w:t>
+            </w:r>
+          </w:p>
+        </w:tc>
+        <w:tc>
+          <w:tcPr/>
+          <w:p>
+            <w:pPr>
+              <w:pStyle w:val="Compact"/>
+              <w:spacing w:line="240" w:lineRule="auto"/>
+              <w:ind w:firstLine="0"/>
+              <w:jc w:val="left"/>
+            </w:pPr>
+            <w:r>
+              <w:rPr>
+                <w:rFonts w:ascii="Times New Roman" w:hAnsi="Times New Roman" w:cs="Times New Roman" w:eastAsia="Times New Roman"/>
+                <w:sz w:val="22"/>
+              </w:rPr>
+              <w:t xml:space="preserve">Dinamika va rivojlanish</w:t>
+            </w:r>
+          </w:p>
+        </w:tc>
+      </w:tr>
+      <w:tr>
+        <w:trPr>
+          <w:cantSplit/>
+        </w:trPr>
+        <w:tc>
+          <w:tcPr/>
+          <w:p>
+            <w:pPr>
+              <w:pStyle w:val="Compact"/>
+              <w:spacing w:line="240" w:lineRule="auto"/>
+              <w:ind w:firstLine="0"/>
+              <w:jc w:val="left"/>
+            </w:pPr>
+            <w:r>
+              <w:rPr>
+                <w:rFonts w:ascii="Times New Roman" w:hAnsi="Times New Roman" w:cs="Times New Roman" w:eastAsia="Times New Roman"/>
+                <w:sz w:val="22"/>
+              </w:rPr>
+              <w:t xml:space="preserve">I.G. Sadikov</w:t>
+            </w:r>
+          </w:p>
+        </w:tc>
+        <w:tc>
+          <w:tcPr/>
+          <w:p>
+            <w:pPr>
+              <w:pStyle w:val="Compact"/>
+              <w:spacing w:line="240" w:lineRule="auto"/>
+              <w:ind w:firstLine="0"/>
+              <w:jc w:val="left"/>
+            </w:pPr>
+            <w:r>
+              <w:rPr>
+                <w:rFonts w:ascii="Times New Roman" w:hAnsi="Times New Roman" w:cs="Times New Roman" w:eastAsia="Times New Roman"/>
+                <w:sz w:val="22"/>
+              </w:rPr>
+              <w:t xml:space="preserve">Bankning foyda olish jarayonida bozordagi mavqeini mustahkamlash orqali ichki va tashqi muhitning salbiy oqibatlariga qarshi tura olish qobiliyati</w:t>
+            </w:r>
+          </w:p>
+        </w:tc>
+        <w:tc>
+          <w:tcPr/>
+          <w:p>
+            <w:pPr>
+              <w:pStyle w:val="Compact"/>
+              <w:spacing w:line="240" w:lineRule="auto"/>
+              <w:ind w:firstLine="0"/>
+              <w:jc w:val="left"/>
+            </w:pPr>
+            <w:r>
+              <w:rPr>
+                <w:rFonts w:ascii="Times New Roman" w:hAnsi="Times New Roman" w:cs="Times New Roman" w:eastAsia="Times New Roman"/>
+                <w:sz w:val="22"/>
+              </w:rPr>
+              <w:t xml:space="preserve">Daromadlilik va bozor mavqei</w:t>
+            </w:r>
+          </w:p>
+        </w:tc>
+      </w:tr>
+      <w:tr>
+        <w:trPr>
+          <w:cantSplit/>
+        </w:trPr>
+        <w:tc>
+          <w:tcPr/>
+          <w:p>
+            <w:pPr>
+              <w:pStyle w:val="Compact"/>
+              <w:spacing w:line="240" w:lineRule="auto"/>
+              <w:ind w:firstLine="0"/>
+              <w:jc w:val="left"/>
+            </w:pPr>
+            <w:r>
+              <w:rPr>
+                <w:rFonts w:ascii="Times New Roman" w:hAnsi="Times New Roman" w:cs="Times New Roman" w:eastAsia="Times New Roman"/>
+                <w:sz w:val="22"/>
+              </w:rPr>
+              <w:t xml:space="preserve">B.A. Madaminov</w:t>
+            </w:r>
+          </w:p>
+        </w:tc>
+        <w:tc>
+          <w:tcPr/>
+          <w:p>
+            <w:pPr>
+              <w:pStyle w:val="Compact"/>
+              <w:spacing w:line="240" w:lineRule="auto"/>
+              <w:ind w:firstLine="0"/>
+              <w:jc w:val="left"/>
+            </w:pPr>
+            <w:r>
+              <w:rPr>
+                <w:rFonts w:ascii="Times New Roman" w:hAnsi="Times New Roman" w:cs="Times New Roman" w:eastAsia="Times New Roman"/>
+                <w:sz w:val="22"/>
+              </w:rPr>
+              <w:t xml:space="preserve">Endogen va ekzogen shoklarni yutib, faoliyatni to‘xtatmasdan muvozanatni tiklash salohiyatini aks ettiruvchi dinamik xususiyat</w:t>
+            </w:r>
+          </w:p>
+        </w:tc>
+        <w:tc>
+          <w:tcPr/>
+          <w:p>
+            <w:pPr>
+              <w:pStyle w:val="Compact"/>
+              <w:spacing w:line="240" w:lineRule="auto"/>
+              <w:ind w:firstLine="0"/>
+              <w:jc w:val="left"/>
+            </w:pPr>
+            <w:r>
+              <w:rPr>
+                <w:rFonts w:ascii="Times New Roman" w:hAnsi="Times New Roman" w:cs="Times New Roman" w:eastAsia="Times New Roman"/>
+                <w:sz w:val="22"/>
+              </w:rPr>
+              <w:t xml:space="preserve">Shoklarga bardoshlilik</w:t>
+            </w:r>
+          </w:p>
+        </w:tc>
+      </w:tr>
+      <w:tr>
+        <w:trPr>
+          <w:cantSplit/>
+        </w:trPr>
+        <w:tc>
+          <w:tcPr/>
+          <w:p>
+            <w:pPr>
+              <w:pStyle w:val="Compact"/>
+              <w:spacing w:line="240" w:lineRule="auto"/>
+              <w:ind w:firstLine="0"/>
+              <w:jc w:val="left"/>
+            </w:pPr>
+            <w:r>
+              <w:rPr>
+                <w:rFonts w:ascii="Times New Roman" w:hAnsi="Times New Roman" w:cs="Times New Roman" w:eastAsia="Times New Roman"/>
+                <w:sz w:val="22"/>
+              </w:rPr>
               <w:t xml:space="preserve">N.H. Sharipova</w:t>
             </w:r>
           </w:p>
@@ -1607,7 +1784,7 @@
           <w:rFonts w:ascii="Times New Roman" w:hAnsi="Times New Roman" w:cs="Times New Roman" w:eastAsia="Times New Roman"/>
           <w:sz w:val="28"/>
         </w:rPr>
-        <w:t xml:space="preserve">Mahalliy tadqiqotlarda ham bu masalaga e’tibor kuchayib bormoqda. Xususan, N.H. Sharipova tijorat banki moliyaviy barqarorligini bankning o‘z funksiyalarini beqaror iqtisodiy sharoitlarda ham uzluksiz va samarali bajarish qobiliyatini ta’minlaydigan, moliyaviy resurslar, kapital va likvidlikni optimal boshqarish orqali barqaror rivojlanishga erishadigan tizimli va dinamik holat sifatida ta’riflaydi</w:t>
+        <w:t xml:space="preserve">Mahalliy iqtisodchi olimlar ham moliyaviy barqarorlik tushunchasini turli nuqtai nazardan talqin qilgan. O.B. Sattarov avvalo «barqarorlik» kategoriyasining o‘zini tahlil qilib, uni statik holat emas, balki dinamik jarayon, ya’ni erishilgan darajani saqlagan holda rivojlanishga intilish sifatida qaraydi va shu asosda bank tizimi barqarorligini «Markaziy bank va tijorat banklari faoliyati davomida o‘z funksiyalarini to‘laqonli bajara olishini ta’minlash imkonini beradigan darajani saqlagan holatda, rivojlanishga qarab intilish» deb ta’riflaydi</w:t>
       </w:r>
       <w:r>
         <w:rPr>
@@ -1620,7 +1797,20 @@
           <w:rFonts w:ascii="Times New Roman" w:hAnsi="Times New Roman" w:cs="Times New Roman" w:eastAsia="Times New Roman"/>
           <w:sz w:val="28"/>
         </w:rPr>
-        <w:t xml:space="preserve">. Bu ta’rifda uzluksizlik va dinamikaga urg‘u berilgani e’tiborga loyiq, ammo unda barqarorlikni qanday o‘lchash mumkinligi, ya’ni uning miqdoriy chegaralari ochiq qolgan.</w:t>
+        <w:t xml:space="preserve">. R.X. Bozorov esa moliyaviy barqarorlikni ikki darajada ko‘rib chiqadi: mikrodarajada u bankning har qanday sharoitda mijozlar oldidagi vazifalarini bajarishda faoliyatining hayotiyligi va davomiyligini ta’minlashni, makrodarajada esa bank tizimining turli iqtisodiy qiyinchiliklarning oldini olishi va tizim barqarorligini ta’minlashini anglatadi</w:t>
+      </w:r>
+      <w:r>
+        <w:rPr>
+          <w:rStyle w:val="FootnoteReference"/>
+        </w:rPr>
+        <w:footnoteReference w:id="32"/>
+      </w:r>
+      <w:r>
+        <w:rPr>
+          <w:rFonts w:ascii="Times New Roman" w:hAnsi="Times New Roman" w:cs="Times New Roman" w:eastAsia="Times New Roman"/>
+          <w:sz w:val="28"/>
+        </w:rPr>
+        <w:t xml:space="preserve">.</w:t>
       </w:r>
     </w:p>
     <w:p>
@@ -1635,13 +1825,110 @@
           <w:rFonts w:ascii="Times New Roman" w:hAnsi="Times New Roman" w:cs="Times New Roman" w:eastAsia="Times New Roman"/>
           <w:sz w:val="28"/>
         </w:rPr>
+        <w:t xml:space="preserve">Keyingi yillardagi tadqiqotlarda ta’riflarning urg‘usi sezilarli darajada o‘zgargan. I.G. Sadikov ta’rifida bozor mavqei va daromadlilik birinchi o‘ringa chiqadi: muallif moliyaviy barqarorlikni bankning foyda olish jarayonida moliyaviy ko‘rsatkichlari va faoliyatining ijobiy holatini ta’minlagan holda bank xizmatlari bozorida o‘z mavqeini mustahkamlash orqali ichki va tashqi muhitning salbiy oqibatlariga qarshi tura olish qobiliyati sifatida ta’riflaydi</w:t>
+      </w:r>
+      <w:r>
+        <w:rPr>
+          <w:rStyle w:val="FootnoteReference"/>
+        </w:rPr>
+        <w:footnoteReference w:id="33"/>
+      </w:r>
+      <w:r>
+        <w:rPr>
+          <w:rFonts w:ascii="Times New Roman" w:hAnsi="Times New Roman" w:cs="Times New Roman" w:eastAsia="Times New Roman"/>
+          <w:sz w:val="28"/>
+        </w:rPr>
+        <w:t xml:space="preserve">. B.A. Madaminov esa barqarorlikni likvidlik va to‘lovga qobiliyatlilik bilan tenglashtiruvchi yondashuvni statik deb tanqid qilib, uni bankning nafaqat muayyan vaqtda majburiyatlarni bajarish, balki endogen va ekzogen shoklarni yutib, faoliyatni to‘xtatmasdan muvozanatni tiklash salohiyatini aks ettiruvchi dinamik xususiyat sifatida belgilaydi</w:t>
+      </w:r>
+      <w:r>
+        <w:rPr>
+          <w:rStyle w:val="FootnoteReference"/>
+        </w:rPr>
+        <w:footnoteReference w:id="34"/>
+      </w:r>
+      <w:r>
+        <w:rPr>
+          <w:rFonts w:ascii="Times New Roman" w:hAnsi="Times New Roman" w:cs="Times New Roman" w:eastAsia="Times New Roman"/>
+          <w:sz w:val="28"/>
+        </w:rPr>
+        <w:t xml:space="preserve">. Sh.Sh. Abdishukurov likvidlik, kapital yetarliligi va rentabellikni «moliyaviy barqarorlik uchburchagi» sifatida qarab, barqarorlikni bitta ko‘rsatkichni optimal darajada ushlab turish emas, balki shu ko‘rsatkichlar o‘rtasidagi muvozanatni ta’minlash qobiliyati deb hisoblaydi</w:t>
+      </w:r>
+      <w:r>
+        <w:rPr>
+          <w:rStyle w:val="FootnoteReference"/>
+        </w:rPr>
+        <w:footnoteReference w:id="35"/>
+      </w:r>
+      <w:r>
+        <w:rPr>
+          <w:rFonts w:ascii="Times New Roman" w:hAnsi="Times New Roman" w:cs="Times New Roman" w:eastAsia="Times New Roman"/>
+          <w:sz w:val="28"/>
+        </w:rPr>
+        <w:t xml:space="preserve">.</w:t>
+      </w:r>
+    </w:p>
+    <w:p>
+      <w:pPr>
+        <w:pStyle w:val="BodyText"/>
+        <w:spacing w:line="360" w:lineRule="auto" w:before="0" w:after="0"/>
+        <w:ind w:firstLine="709"/>
+        <w:jc w:val="both"/>
+      </w:pPr>
+      <w:r>
+        <w:rPr>
+          <w:rFonts w:ascii="Times New Roman" w:hAnsi="Times New Roman" w:cs="Times New Roman" w:eastAsia="Times New Roman"/>
+          <w:sz w:val="28"/>
+        </w:rPr>
+        <w:t xml:space="preserve">N.H. Sharipova tijorat banki moliyaviy barqarorligini bankning o‘z funksiyalarini beqaror iqtisodiy sharoitlarda ham uzluksiz va samarali bajarish qobiliyatini ta’minlaydigan, moliyaviy resurslar, kapital va likvidlikni optimal boshqarish orqali barqaror rivojlanishga erishadigan tizimli va dinamik holat sifatida ta’riflaydi</w:t>
+      </w:r>
+      <w:r>
+        <w:rPr>
+          <w:rStyle w:val="FootnoteReference"/>
+        </w:rPr>
+        <w:footnoteReference w:id="36"/>
+      </w:r>
+      <w:r>
+        <w:rPr>
+          <w:rFonts w:ascii="Times New Roman" w:hAnsi="Times New Roman" w:cs="Times New Roman" w:eastAsia="Times New Roman"/>
+          <w:sz w:val="28"/>
+        </w:rPr>
+        <w:t xml:space="preserve">. Bu ta’rifda uzluksizlik va dinamikaga urg‘u berilgani e’tiborga loyiq.</w:t>
+      </w:r>
+    </w:p>
+    <w:p>
+      <w:pPr>
+        <w:pStyle w:val="BodyText"/>
+        <w:spacing w:line="360" w:lineRule="auto" w:before="0" w:after="0"/>
+        <w:ind w:firstLine="709"/>
+        <w:jc w:val="both"/>
+      </w:pPr>
+      <w:r>
+        <w:rPr>
+          <w:rFonts w:ascii="Times New Roman" w:hAnsi="Times New Roman" w:cs="Times New Roman" w:eastAsia="Times New Roman"/>
+          <w:sz w:val="28"/>
+        </w:rPr>
+        <w:t xml:space="preserve">Mahalliy olimlarning ta’riflarini umumlashtirish shuni ko‘rsatadiki, ularda ikki umumiy jihat kuzatiladi. Birinchidan, deyarli barcha mualliflar barqarorlikning dinamik tabiatini ta’kidlaydi va uni muayyan sanadagi holat bilan emas, balki shoklarga bardosh berish va rivojlanishni davom ettirish qobiliyati bilan bog‘laydi. Ikkinchidan, ta’riflarning birortasida ham barqarorlikni qaysi me’yorlar va qaysi hisobot standarti asosida o‘lchash kerakligi, ya’ni uning miqdoriy chegaralari aniq ko‘rsatilmagan. Bu masala amaliy ahamiyatga ega, chunki ikkinchi bobda ko‘rsatilganidek, bir xil bankning aktivlar sifati milliy hisobot va MHXS bo‘yicha bir necha barobar farq qiladigan natija berishi mumkin. Demak, moliyaviy barqarorlik ta’rifi uning xalqaro standartlarda belgilangan chegaralarga nisbatan o‘lchanishini ham nazarda tutishi lozim.</w:t>
+      </w:r>
+    </w:p>
+    <w:p>
+      <w:pPr>
+        <w:pStyle w:val="BodyText"/>
+        <w:spacing w:line="360" w:lineRule="auto" w:before="0" w:after="0"/>
+        <w:ind w:firstLine="709"/>
+        <w:jc w:val="both"/>
+      </w:pPr>
+      <w:r>
+        <w:rPr>
+          <w:rFonts w:ascii="Times New Roman" w:hAnsi="Times New Roman" w:cs="Times New Roman" w:eastAsia="Times New Roman"/>
+          <w:sz w:val="28"/>
+        </w:rPr>
         <w:t xml:space="preserve">Ta’riflardagi xilma-xillikka qaramay, ularning aksariyatida uchta umumiy mezon kuzatiladi. Birinchisi – statik mezon, ya’ni bankning muayyan sanada majburiyatlarini qoplash uchun yetarli kapital va sifatli aktivlarga ega bo‘lishi, boshqacha aytganda, to‘lovga qobiliyatliligi. Ikkinchisi – dinamik mezon, ya’ni kutilmagan shoklar va bozor tebranishlari yuzaga kelganda zararlarni yutib, o‘z holatini tiklay olish qobiliyati. Uchinchisi – funksional mezon, ya’ni stress sharoitida ham iqtisodiyotni kreditlash va to‘lovlarni amalga oshirish funksiyalarini yo‘qotmaslik. A. Krokett ham moliyaviy barqarorlikni asosiy moliya institutlari va bozorlarning barqarorligi sifatida ta’riflab, uning mezoni sifatida institutlarning o‘z shartnoma majburiyatlarini tashqi yordamsiz bajara olishi va bozorlarda narxlarning fundamental omillarni aks ettirishini ko‘rsatadi</w:t>
       </w:r>
       <w:r>
         <w:rPr>
           <w:rStyle w:val="FootnoteReference"/>
         </w:rPr>
-        <w:footnoteReference w:id="32"/>
+        <w:footnoteReference w:id="37"/>
       </w:r>
       <w:r>
         <w:rPr>
@@ -2725,7 +3012,7 @@
         <w:rPr>
           <w:rStyle w:val="FootnoteReference"/>
         </w:rPr>
-        <w:footnoteReference w:id="33"/>
+        <w:footnoteReference w:id="38"/>
       </w:r>
     </w:p>
     <w:p>
@@ -2761,7 +3048,7 @@
         <w:rPr>
           <w:rStyle w:val="FootnoteReference"/>
         </w:rPr>
-        <w:footnoteReference w:id="34"/>
+        <w:footnoteReference w:id="39"/>
       </w:r>
       <w:r>
         <w:rPr>
@@ -3184,7 +3471,7 @@
         <w:rPr>
           <w:rStyle w:val="FootnoteReference"/>
         </w:rPr>
-        <w:footnoteReference w:id="35"/>
+        <w:footnoteReference w:id="40"/>
       </w:r>
     </w:p>
     <w:p>
@@ -3205,7 +3492,7 @@
         <w:rPr>
           <w:rStyle w:val="FootnoteReference"/>
         </w:rPr>
-        <w:footnoteReference w:id="36"/>
+        <w:footnoteReference w:id="41"/>
       </w:r>
       <w:r>
         <w:rPr>
@@ -3233,7 +3520,7 @@
         <w:rPr>
           <w:rStyle w:val="FootnoteReference"/>
         </w:rPr>
-        <w:footnoteReference w:id="37"/>
+        <w:footnoteReference w:id="42"/>
       </w:r>
       <w:r>
         <w:rPr>
@@ -3261,7 +3548,7 @@
         <w:rPr>
           <w:rStyle w:val="FootnoteReference"/>
         </w:rPr>
-        <w:footnoteReference w:id="38"/>
+        <w:footnoteReference w:id="43"/>
       </w:r>
       <w:r>
         <w:rPr>
@@ -3884,7 +4171,7 @@
         <w:rPr>
           <w:rStyle w:val="FootnoteReference"/>
         </w:rPr>
-        <w:footnoteReference w:id="39"/>
+        <w:footnoteReference w:id="44"/>
       </w:r>
     </w:p>
     <w:p>
@@ -3905,7 +4192,7 @@
         <w:rPr>
           <w:rStyle w:val="FootnoteReference"/>
         </w:rPr>
-        <w:footnoteReference w:id="40"/>
+        <w:footnoteReference w:id="45"/>
       </w:r>
       <w:r>
         <w:rPr>
@@ -3961,7 +4248,7 @@
         <w:rPr>
           <w:rStyle w:val="FootnoteReference"/>
         </w:rPr>
-        <w:footnoteReference w:id="41"/>
+        <w:footnoteReference w:id="46"/>
       </w:r>
     </w:p>
     <w:p>
@@ -3982,7 +4269,7 @@
         <w:rPr>
           <w:rStyle w:val="FootnoteReference"/>
         </w:rPr>
-        <w:footnoteReference w:id="42"/>
+        <w:footnoteReference w:id="47"/>
       </w:r>
       <w:r>
         <w:rPr>
@@ -3995,7 +4282,7 @@
         <w:rPr>
           <w:rStyle w:val="FootnoteReference"/>
         </w:rPr>
-        <w:footnoteReference w:id="43"/>
+        <w:footnoteReference w:id="48"/>
       </w:r>
       <w:r>
         <w:rPr>
@@ -4023,7 +4310,7 @@
         <w:rPr>
           <w:rStyle w:val="FootnoteReference"/>
         </w:rPr>
-        <w:footnoteReference w:id="44"/>
+        <w:footnoteReference w:id="49"/>
       </w:r>
       <w:r>
         <w:rPr>
@@ -4036,7 +4323,7 @@
         <w:rPr>
           <w:rStyle w:val="FootnoteReference"/>
         </w:rPr>
-        <w:footnoteReference w:id="45"/>
+        <w:footnoteReference w:id="50"/>
       </w:r>
       <w:r>
         <w:rPr>
@@ -4064,7 +4351,7 @@
         <w:rPr>
           <w:rStyle w:val="FootnoteReference"/>
         </w:rPr>
-        <w:footnoteReference w:id="46"/>
+        <w:footnoteReference w:id="51"/>
       </w:r>
       <w:r>
         <w:rPr>
@@ -4077,7 +4364,7 @@
         <w:rPr>
           <w:rStyle w:val="FootnoteReference"/>
         </w:rPr>
-        <w:footnoteReference w:id="47"/>
+        <w:footnoteReference w:id="52"/>
       </w:r>
       <w:r>
         <w:rPr>
@@ -4105,7 +4392,7 @@
         <w:rPr>
           <w:rStyle w:val="FootnoteReference"/>
         </w:rPr>
-        <w:footnoteReference w:id="48"/>
+        <w:footnoteReference w:id="53"/>
       </w:r>
       <w:r>
         <w:rPr>
@@ -4118,7 +4405,7 @@
         <w:rPr>
           <w:rStyle w:val="FootnoteReference"/>
         </w:rPr>
-        <w:footnoteReference w:id="49"/>
+        <w:footnoteReference w:id="54"/>
       </w:r>
       <w:r>
         <w:rPr>
@@ -4131,7 +4418,7 @@
         <w:rPr>
           <w:rStyle w:val="FootnoteReference"/>
         </w:rPr>
-        <w:footnoteReference w:id="50"/>
+        <w:footnoteReference w:id="55"/>
       </w:r>
       <w:r>
         <w:rPr>
@@ -4159,7 +4446,7 @@
         <w:rPr>
           <w:rStyle w:val="FootnoteReference"/>
         </w:rPr>
-        <w:footnoteReference w:id="51"/>
+        <w:footnoteReference w:id="56"/>
       </w:r>
       <w:r>
         <w:rPr>
@@ -4172,7 +4459,7 @@
         <w:rPr>
           <w:rStyle w:val="FootnoteReference"/>
         </w:rPr>
-        <w:footnoteReference w:id="52"/>
+        <w:footnoteReference w:id="57"/>
       </w:r>
       <w:r>
         <w:rPr>
@@ -4200,7 +4487,7 @@
         <w:rPr>
           <w:rStyle w:val="FootnoteReference"/>
         </w:rPr>
-        <w:footnoteReference w:id="53"/>
+        <w:footnoteReference w:id="58"/>
       </w:r>
       <w:r>
         <w:rPr>
@@ -4213,7 +4500,7 @@
         <w:rPr>
           <w:rStyle w:val="FootnoteReference"/>
         </w:rPr>
-        <w:footnoteReference w:id="54"/>
+        <w:footnoteReference w:id="59"/>
       </w:r>
       <w:r>
         <w:rPr>
@@ -4269,7 +4556,7 @@
         <w:rPr>
           <w:rStyle w:val="FootnoteReference"/>
         </w:rPr>
-        <w:footnoteReference w:id="55"/>
+        <w:footnoteReference w:id="60"/>
       </w:r>
     </w:p>
     <w:p>
@@ -4290,7 +4577,7 @@
         <w:rPr>
           <w:rStyle w:val="FootnoteReference"/>
         </w:rPr>
-        <w:footnoteReference w:id="56"/>
+        <w:footnoteReference w:id="61"/>
       </w:r>
       <w:r>
         <w:rPr>
@@ -4318,7 +4605,7 @@
         <w:rPr>
           <w:rStyle w:val="FootnoteReference"/>
         </w:rPr>
-        <w:footnoteReference w:id="57"/>
+        <w:footnoteReference w:id="62"/>
       </w:r>
       <w:r>
         <w:rPr>
@@ -4331,7 +4618,7 @@
         <w:rPr>
           <w:rStyle w:val="FootnoteReference"/>
         </w:rPr>
-        <w:footnoteReference w:id="58"/>
+        <w:footnoteReference w:id="63"/>
       </w:r>
       <w:r>
         <w:rPr>
@@ -4344,7 +4631,7 @@
         <w:rPr>
           <w:rStyle w:val="FootnoteReference"/>
         </w:rPr>
-        <w:footnoteReference w:id="59"/>
+        <w:footnoteReference w:id="64"/>
       </w:r>
       <w:r>
         <w:rPr>
@@ -4372,7 +4659,7 @@
         <w:rPr>
           <w:rStyle w:val="FootnoteReference"/>
         </w:rPr>
-        <w:footnoteReference w:id="60"/>
+        <w:footnoteReference w:id="65"/>
       </w:r>
       <w:r>
         <w:rPr>
@@ -4420,7 +4707,7 @@
         <w:rPr>
           <w:rStyle w:val="FootnoteReference"/>
         </w:rPr>
-        <w:footnoteReference w:id="61"/>
+        <w:footnoteReference w:id="66"/>
       </w:r>
     </w:p>
     <w:tbl>
@@ -5999,7 +6286,7 @@
         <w:rPr>
           <w:rStyle w:val="FootnoteReference"/>
         </w:rPr>
-        <w:footnoteReference w:id="62"/>
+        <w:footnoteReference w:id="67"/>
       </w:r>
     </w:p>
     <w:p>
@@ -6032,7 +6319,7 @@
         <w:t xml:space="preserve">Tijorat banklari moliyaviy barqarorligining iqtisodiy mazmuni va konseptual modellarini tadqiq etgan holda xulosa qilish mumkinki, moliyaviy barqarorlik stabillik, ishonchlilik va muvozanat kabi yaqin tushunchalardan farqli o‘laroq, bankning rivojlanish jarayoniga xos dinamik va kompleks xususiyatdir. Iqtisodiy adabiyotda bu tushunchaga resurs, institutsional-funksional, ishonch hamda risk va chidamlilik yondashuvlari asosida turlicha ta’rif berilgan bo‘lib, ular bir-birini to‘ldiradi. Moliyaviy barqarorlik alohida bank, bank tizimi va moliya tizimi darajalarida namoyon bo‘ladi va bu darajalar o‘zaro ta’sirda bo‘ladi, unga esa tashqi va ichki omillar, jumladan, ishonch va aktivlar sifati hal qiluvchi ta’sir ko‘rsatadi. Likvidlik yaratish, moliyaviy beqarorlik, kapital-bufer, Z-score, makroprudensial va kelajakka yo‘naltirilgan risk modellari moliyaviy barqarorlikning turli tomonlarini tushuntiradi, nazorat amaliyoti esa mikroprudensial konsepsiyadan makroprudensial va kelajakka yo‘naltirilgan konsepsiyalar sinteziga o‘tmoqda, ammo ularning birortasi alohida olinganda tijorat banki barqarorligini to‘liq tavsiflay olmaydi. Bu o‘z navbatida, kapital, aktivlar sifati, likvidlik, daromadlilik va boshqaruv sifati bloklarini ularning darajasi, dinamikasi va muvozanati bilan birga hisobga oladigan integral baholash metodikasini ishlab chiqish zaruriyatini yuzaga keltiradi. Bunday metodikaning xalqaro standartlar bilan bog‘liqligi keyingi paragrafda tahlil qilinadi.</w:t>
       </w:r>
     </w:p>
-    <w:bookmarkEnd w:id="63"/>
+    <w:bookmarkEnd w:id="68"/>
     <w:sectPr>
       <w:pgMar w:left="1701" w:right="850" w:top="1134" w:bottom="1134"/>
     </w:sectPr>
@@ -6170,7 +6457,7 @@
         <w:t xml:space="preserve"> </w:t>
       </w:r>
       <w:r>
-        <w:t xml:space="preserve">Tadqiqot natijasida muallif tomonidan quyidagi manbalar asosida ishlab chiqildi: Оценка финансовой устойчивости кредитной организации: учебник / под ред. О.И. Лаврушина, И.Д. Мамоновой. – М.: КНОРУС, 2011. – С. 24; Устойчивость банковской системы и развитие банковской политики: монография / под ред. О.И. Лаврушина. – М.: КНОРУС, 2014. – С. 38; Schinasi G.J. Defining Financial Stability: IMF Working Paper WP/04/187. – Washington, DC: International Monetary Fund, 2004. – 18 p; Mishkin F.S. Global Financial Instability: Framework, Events, Issues // Journal of Economic Perspectives. – 1999. – Vol. 13, No. 4. – P. 3–20; Hendrickson J.M. Regulation and Instability in U.S. Commercial Banking: A History of Crises. – Basingstoke: Palgrave Macmillan, 2011. – P. 6–7; Thakor A.V. Leverage, System Risk and Financial System Health: How Do We Develop a Healthy Financial System? // Governance, Regulation and Bank Stability / ed. by T. Lindblom, S. Sjögren, M. Willesson. – Basingstoke: Palgrave Macmillan, 2014. – P. 13–16; Sharipova N.H. Tijorat banklari moliyaviy barqarorligini mustahkamlashning konseptual asoslarini takomillashtirish: iqtisodiyot fanlari doktori (DSc) dissertatsiyasi avtoreferati. – Toshkent, 2026. – B. 13–14.</w:t>
+        <w:t xml:space="preserve">Tadqiqot natijasida muallif tomonidan quyidagi manbalar asosida ishlab chiqildi: Оценка финансовой устойчивости кредитной организации: учебник / под ред. О.И. Лаврушина, И.Д. Мамоновой. – М.: КНОРУС, 2011. – С. 24; Устойчивость банковской системы и развитие банковской политики: монография / под ред. О.И. Лаврушина. – М.: КНОРУС, 2014. – С. 38; Schinasi G.J. Defining Financial Stability: IMF Working Paper WP/04/187. – Washington, DC: International Monetary Fund, 2004. – 18 p; Mishkin F.S. Global Financial Instability: Framework, Events, Issues // Journal of Economic Perspectives. – 1999. – Vol. 13, No. 4. – P. 3–20; Hendrickson J.M. Regulation and Instability in U.S. Commercial Banking: A History of Crises. – Basingstoke: Palgrave Macmillan, 2011. – P. 6–7; Thakor A.V. Leverage, System Risk and Financial System Health: How Do We Develop a Healthy Financial System? // Governance, Regulation and Bank Stability / ed. by T. Lindblom, S. Sjögren, M. Willesson. – Basingstoke: Palgrave Macmillan, 2014. – P. 13–16; Sattarov O.B. O‘zbekiston Respublikasi bank tizimi barqarorligini ta’minlash metodologiyasini takomillashtirish: iqtisodiyot fanlari doktori (DSc) dissertatsiyasi avtoreferati. – Toshkent, 2018. – B. 13; Sadikov I.G. Iqtisodiyotni transformatsiyalash jarayonida tijorat banklarining moliyaviy barqarorligini ta’minlash yo‘llari: iqtisodiyot fanlari bo‘yicha falsafa doktori (PhD) dissertatsiyasi avtoreferati. – Toshkent, 2025. – B. 11; Madaminov B.A. Tijorat banklarida risk-menejment tizimini takomillashtirish asosida moliyaviy barqarorlikni ta’minlash metodologiyasi: iqtisodiyot fanlari doktori (DSc) dissertatsiyasi avtoreferati. – Toshkent, 2026. – B. 12; Sharipova N.H. Tijorat banklari moliyaviy barqarorligini mustahkamlashning konseptual asoslarini takomillashtirish: iqtisodiyot fanlari doktori (DSc) dissertatsiyasi avtoreferati. – Toshkent, 2026. – B. 13–14.</w:t>
       </w:r>
     </w:p>
   </w:footnote>
@@ -6284,7 +6571,7 @@
         <w:t xml:space="preserve"> </w:t>
       </w:r>
       <w:r>
-        <w:t xml:space="preserve">Sharipova N.H. Tijorat banklari moliyaviy barqarorligini mustahkamlashning konseptual asoslarini takomillashtirish: iqtisodiyot fanlari doktori (DSc) dissertatsiyasi avtoreferati. – Toshkent, 2026. – B. 13–14.</w:t>
+        <w:t xml:space="preserve">Sattarov O.B. O‘zbekiston Respublikasi bank tizimi barqarorligini ta’minlash metodologiyasini takomillashtirish: iqtisodiyot fanlari doktori (DSc) dissertatsiyasi avtoreferati. – Toshkent, 2018. – B. 13.</w:t>
       </w:r>
     </w:p>
   </w:footnote>
@@ -6303,7 +6590,7 @@
         <w:t xml:space="preserve"> </w:t>
       </w:r>
       <w:r>
-        <w:t xml:space="preserve">Crockett A. Why Is Financial Stability a Goal of Public Policy? // Maintaining Financial Stability in a Global Economy. – Kansas City: Federal Reserve Bank of Kansas City, 1997. – P. 7–36.</w:t>
+        <w:t xml:space="preserve">Bozorov R.X. Tijorat banklari moliyaviy barqarorligini ta’minlashni takomillashtirish: iqtisodiyot fanlari bo‘yicha falsafa doktori (PhD) dissertatsiyasi avtoreferati. – Toshkent, 2020. – B. 11.</w:t>
       </w:r>
     </w:p>
   </w:footnote>
@@ -6322,7 +6609,7 @@
         <w:t xml:space="preserve"> </w:t>
       </w:r>
       <w:r>
-        <w:t xml:space="preserve">Tadqiqot natijasida muallif tomonidan ishlab chiqildi.</w:t>
+        <w:t xml:space="preserve">Sadikov I.G. Iqtisodiyotni transformatsiyalash jarayonida tijorat banklarining moliyaviy barqarorligini ta’minlash yo‘llari: iqtisodiyot fanlari bo‘yicha falsafa doktori (PhD) dissertatsiyasi avtoreferati. – Toshkent, 2025. – B. 11.</w:t>
       </w:r>
     </w:p>
   </w:footnote>
@@ -6341,7 +6628,7 @@
         <w:t xml:space="preserve"> </w:t>
       </w:r>
       <w:r>
-        <w:t xml:space="preserve">Оценка финансовой устойчивости кредитной организации: учебник / под ред. О.И. Лаврушина, И.Д. Мамоновой. – М.: КНОРУС, 2011. – С. 41–45.</w:t>
+        <w:t xml:space="preserve">Madaminov B.A. Tijorat banklarida risk-menejment tizimini takomillashtirish asosida moliyaviy barqarorlikni ta’minlash metodologiyasi: iqtisodiyot fanlari doktori (DSc) dissertatsiyasi avtoreferati. – Toshkent, 2026. – B. 12.</w:t>
       </w:r>
     </w:p>
   </w:footnote>
@@ -6360,7 +6647,7 @@
         <w:t xml:space="preserve"> </w:t>
       </w:r>
       <w:r>
-        <w:t xml:space="preserve">Tadqiqot natijasida muallif tomonidan quyidagi manbalar asosida ishlab chiqildi: Оценка финансовой устойчивости кредитной организации: учебник / под ред. О.И. Лаврушина, И.Д. Мамоновой. – М.: КНОРУС, 2011. – С. 41–45; Регулирование банковской сферы: учебник / под ред. О.Н. Афанасьевой, С.Е. Дубовой. – М.: КНОРУС. – С. 49–55.</w:t>
+        <w:t xml:space="preserve">Abdishukurov Sh.Sh. Tijorat banklarining moliyaviy barqarorligini ta’minlash yo‘nalishlari: iqtisodiyot fanlari bo‘yicha falsafa doktori (PhD) dissertatsiyasi avtoreferati. – Toshkent, 2026. – B. 15.</w:t>
       </w:r>
     </w:p>
   </w:footnote>
@@ -6379,7 +6666,7 @@
         <w:t xml:space="preserve"> </w:t>
       </w:r>
       <w:r>
-        <w:t xml:space="preserve">Регулирование банковской сферы: учебник / под ред. О.Н. Афанасьевой, С.Е. Дубовой. – М.: КНОРУС. – С. 49.</w:t>
+        <w:t xml:space="preserve">Sharipova N.H. Tijorat banklari moliyaviy barqarorligini mustahkamlashning konseptual asoslarini takomillashtirish: iqtisodiyot fanlari doktori (DSc) dissertatsiyasi avtoreferati. – Toshkent, 2026. – B. 13–14.</w:t>
       </w:r>
     </w:p>
   </w:footnote>
@@ -6398,7 +6685,7 @@
         <w:t xml:space="preserve"> </w:t>
       </w:r>
       <w:r>
-        <w:t xml:space="preserve">Оценка финансовой устойчивости кредитной организации: учебник / под ред. О.И. Лаврушина, И.Д. Мамоновой. – М.: КНОРУС, 2011. – С. 28–31.</w:t>
+        <w:t xml:space="preserve">Crockett A. Why Is Financial Stability a Goal of Public Policy? // Maintaining Financial Stability in a Global Economy. – Kansas City: Federal Reserve Bank of Kansas City, 1997. – P. 7–36.</w:t>
       </w:r>
     </w:p>
   </w:footnote>
@@ -6417,7 +6704,7 @@
         <w:t xml:space="preserve"> </w:t>
       </w:r>
       <w:r>
-        <w:t xml:space="preserve">Оценка финансовой устойчивости кредитной организации: учебник / под ред. О.И. Лаврушина, И.Д. Мамоновой. – М.: КНОРУС, 2011. – С. 31–41.</w:t>
+        <w:t xml:space="preserve">Tadqiqot natijasida muallif tomonidan ishlab chiqildi.</w:t>
       </w:r>
     </w:p>
   </w:footnote>
@@ -6436,7 +6723,7 @@
         <w:t xml:space="preserve"> </w:t>
       </w:r>
       <w:r>
-        <w:t xml:space="preserve">Tadqiqot natijasida muallif tomonidan quyidagi manbalar asosida ishlab chiqildi: Оценка финансовой устойчивости кредитной организации: учебник / под ред. О.И. Лаврушина, И.Д. Мамоновой. – М.: КНОРУС, 2011. – С. 31–41.</w:t>
+        <w:t xml:space="preserve">Оценка финансовой устойчивости кредитной организации: учебник / под ред. О.И. Лаврушина, И.Д. Мамоновой. – М.: КНОРУС, 2011. – С. 41–45.</w:t>
       </w:r>
     </w:p>
   </w:footnote>
@@ -6455,7 +6742,7 @@
         <w:t xml:space="preserve"> </w:t>
       </w:r>
       <w:r>
-        <w:t xml:space="preserve">Оценка финансовой устойчивости кредитной организации: учебник / под ред. О.И. Лаврушина, И.Д. Мамоновой. – М.: КНОРУС, 2011. – С. 35–36.</w:t>
+        <w:t xml:space="preserve">Tadqiqot natijasida muallif tomonidan quyidagi manbalar asosida ishlab chiqildi: Оценка финансовой устойчивости кредитной организации: учебник / под ред. О.И. Лаврушина, И.Д. Мамоновой. – М.: КНОРУС, 2011. – С. 41–45; Регулирование банковской сферы: учебник / под ред. О.Н. Афанасьевой, С.Е. Дубовой. – М.: КНОРУС. – С. 49–55.</w:t>
       </w:r>
     </w:p>
   </w:footnote>
@@ -6474,7 +6761,7 @@
         <w:t xml:space="preserve"> </w:t>
       </w:r>
       <w:r>
-        <w:t xml:space="preserve">Tadqiqot natijasida muallif tomonidan quyidagi manba ma’lumotlari asosida ishlab chiqildi: Оценка финансовой устойчивости кредитной организации: учебник / под ред. О.И. Лаврушина, И.Д. Мамоновой. – М.: КНОРУС, 2011. – С. 44.</w:t>
+        <w:t xml:space="preserve">Регулирование банковской сферы: учебник / под ред. О.Н. Афанасьевой, С.Е. Дубовой. – М.: КНОРУС. – С. 49.</w:t>
       </w:r>
     </w:p>
   </w:footnote>
@@ -6493,7 +6780,7 @@
         <w:t xml:space="preserve"> </w:t>
       </w:r>
       <w:r>
-        <w:t xml:space="preserve">Оценка финансовой устойчивости кредитной организации: учебник / под ред. О.И. Лаврушина, И.Д. Мамоновой. – М.: КНОРУС, 2011. – С. 44.</w:t>
+        <w:t xml:space="preserve">Оценка финансовой устойчивости кредитной организации: учебник / под ред. О.И. Лаврушина, И.Д. Мамоновой. – М.: КНОРУС, 2011. – С. 28–31.</w:t>
       </w:r>
     </w:p>
   </w:footnote>
@@ -6512,7 +6799,7 @@
         <w:t xml:space="preserve"> </w:t>
       </w:r>
       <w:r>
-        <w:t xml:space="preserve">Оценка финансовой устойчивости кредитной организации: учебник / под ред. О.И. Лаврушина, И.Д. Мамоновой. – М.: КНОРУС, 2011. – С. 45.</w:t>
+        <w:t xml:space="preserve">Оценка финансовой устойчивости кредитной организации: учебник / под ред. О.И. Лаврушина, И.Д. Мамоновой. – М.: КНОРУС, 2011. – С. 31–41.</w:t>
       </w:r>
     </w:p>
   </w:footnote>
@@ -6531,7 +6818,7 @@
         <w:t xml:space="preserve"> </w:t>
       </w:r>
       <w:r>
-        <w:t xml:space="preserve">Peláez C.M., Peláez C.A. Regulation of Banks and Finance: Theory and Policy after the Credit Crisis. – Basingstoke: Palgrave Macmillan, 2009. – P. 17.</w:t>
+        <w:t xml:space="preserve">Tadqiqot natijasida muallif tomonidan quyidagi manbalar asosida ishlab chiqildi: Оценка финансовой устойчивости кредитной организации: учебник / под ред. О.И. Лаврушина, И.Д. Мамоновой. – М.: КНОРУС, 2011. – С. 31–41.</w:t>
       </w:r>
     </w:p>
   </w:footnote>
@@ -6550,7 +6837,7 @@
         <w:t xml:space="preserve"> </w:t>
       </w:r>
       <w:r>
-        <w:t xml:space="preserve">Tarullo D.K. Banking on Basel: The Future of International Financial Regulation. – Washington, DC: Peterson Institute for International Economics, 2008. – P. 19–23.</w:t>
+        <w:t xml:space="preserve">Оценка финансовой устойчивости кредитной организации: учебник / под ред. О.И. Лаврушина, И.Д. Мамоновой. – М.: КНОРУС, 2011. – С. 35–36.</w:t>
       </w:r>
     </w:p>
   </w:footnote>
@@ -6569,7 +6856,7 @@
         <w:t xml:space="preserve"> </w:t>
       </w:r>
       <w:r>
-        <w:t xml:space="preserve">Diamond D.W., Dybvig P.H. Bank Runs, Deposit Insurance, and Liquidity // Journal of Political Economy. – 1983. – Vol. 91, No. 3. – P. 401–419.</w:t>
+        <w:t xml:space="preserve">Tadqiqot natijasida muallif tomonidan quyidagi manba ma’lumotlari asosida ishlab chiqildi: Оценка финансовой устойчивости кредитной организации: учебник / под ред. О.И. Лаврушина, И.Д. Мамоновой. – М.: КНОРУС, 2011. – С. 44.</w:t>
       </w:r>
     </w:p>
   </w:footnote>
@@ -6588,7 +6875,7 @@
         <w:t xml:space="preserve"> </w:t>
       </w:r>
       <w:r>
-        <w:t xml:space="preserve">Peláez C.M., Peláez C.A. Regulation of Banks and Finance: Theory and Policy after the Credit Crisis. – Basingstoke: Palgrave Macmillan, 2009. – P. 61–66.</w:t>
+        <w:t xml:space="preserve">Оценка финансовой устойчивости кредитной организации: учебник / под ред. О.И. Лаврушина, И.Д. Мамоновой. – М.: КНОРУС, 2011. – С. 44.</w:t>
       </w:r>
     </w:p>
   </w:footnote>
@@ -6607,7 +6894,7 @@
         <w:t xml:space="preserve"> </w:t>
       </w:r>
       <w:r>
-        <w:t xml:space="preserve">Minsky H.P. The Financial Instability Hypothesis: Working Paper No. 74. – Annandale-on-Hudson: The Jerome Levy Economics Institute of Bard College, 1992. – 10 p.</w:t>
+        <w:t xml:space="preserve">Оценка финансовой устойчивости кредитной организации: учебник / под ред. О.И. Лаврушина, И.Д. Мамоновой. – М.: КНОРУС, 2011. – С. 45.</w:t>
       </w:r>
     </w:p>
   </w:footnote>
@@ -6626,7 +6913,7 @@
         <w:t xml:space="preserve"> </w:t>
       </w:r>
       <w:r>
-        <w:t xml:space="preserve">Hendrickson J.M. Regulation and Instability in U.S. Commercial Banking: A History of Crises. – Basingstoke: Palgrave Macmillan, 2011. – P. 5–6.</w:t>
+        <w:t xml:space="preserve">Peláez C.M., Peláez C.A. Regulation of Banks and Finance: Theory and Policy after the Credit Crisis. – Basingstoke: Palgrave Macmillan, 2009. – P. 17.</w:t>
       </w:r>
     </w:p>
   </w:footnote>
@@ -6645,7 +6932,7 @@
         <w:t xml:space="preserve"> </w:t>
       </w:r>
       <w:r>
-        <w:t xml:space="preserve">Thakor A.V. Leverage, System Risk and Financial System Health: How Do We Develop a Healthy Financial System? // Governance, Regulation and Bank Stability / ed. by T. Lindblom, S. Sjögren, M. Willesson. – Basingstoke: Palgrave Macmillan, 2014. – P. 10–12.</w:t>
+        <w:t xml:space="preserve">Tarullo D.K. Banking on Basel: The Future of International Financial Regulation. – Washington, DC: Peterson Institute for International Economics, 2008. – P. 19–23.</w:t>
       </w:r>
     </w:p>
   </w:footnote>
@@ -6664,7 +6951,7 @@
         <w:t xml:space="preserve"> </w:t>
       </w:r>
       <w:r>
-        <w:t xml:space="preserve">Tarullo D.K. Banking on Basel: The Future of International Financial Regulation. – Washington, DC: Peterson Institute for International Economics, 2008. – P. 16.</w:t>
+        <w:t xml:space="preserve">Diamond D.W., Dybvig P.H. Bank Runs, Deposit Insurance, and Liquidity // Journal of Political Economy. – 1983. – Vol. 91, No. 3. – P. 401–419.</w:t>
       </w:r>
     </w:p>
   </w:footnote>
@@ -6683,7 +6970,7 @@
         <w:t xml:space="preserve"> </w:t>
       </w:r>
       <w:r>
-        <w:t xml:space="preserve">Merton R.C. On the Pricing of Corporate Debt: The Risk Structure of Interest Rates // Journal of Finance. – 1974. – Vol. 29, No. 2. – P. 449–470.</w:t>
+        <w:t xml:space="preserve">Peláez C.M., Peláez C.A. Regulation of Banks and Finance: Theory and Policy after the Credit Crisis. – Basingstoke: Palgrave Macmillan, 2009. – P. 61–66.</w:t>
       </w:r>
     </w:p>
   </w:footnote>
@@ -6702,7 +6989,7 @@
         <w:t xml:space="preserve"> </w:t>
       </w:r>
       <w:r>
-        <w:t xml:space="preserve">Roy A.D. Safety First and the Holding of Assets // Econometrica. – 1952. – Vol. 20, No. 3. – P. 431–449.</w:t>
+        <w:t xml:space="preserve">Minsky H.P. The Financial Instability Hypothesis: Working Paper No. 74. – Annandale-on-Hudson: The Jerome Levy Economics Institute of Bard College, 1992. – 10 p.</w:t>
       </w:r>
     </w:p>
   </w:footnote>
@@ -6721,7 +7008,7 @@
         <w:t xml:space="preserve"> </w:t>
       </w:r>
       <w:r>
-        <w:t xml:space="preserve">Boyd J.H., Graham S.L. Risk, Regulation, and Bank Holding Company Expansion into Nonbanking // Federal Reserve Bank of Minneapolis Quarterly Review. – 1986. – Vol. 10, No. 2. – P. 2–17.</w:t>
+        <w:t xml:space="preserve">Hendrickson J.M. Regulation and Instability in U.S. Commercial Banking: A History of Crises. – Basingstoke: Palgrave Macmillan, 2011. – P. 5–6.</w:t>
       </w:r>
     </w:p>
   </w:footnote>
@@ -6740,7 +7027,7 @@
         <w:t xml:space="preserve"> </w:t>
       </w:r>
       <w:r>
-        <w:t xml:space="preserve">Tadqiqot natijasida muallif tomonidan quyidagi manba ma’lumotlari asosida ishlab chiqildi: Chiaramonte L., Poli F. Predicting European Bank Distress: Evidence from the Recent Financial Crisis // Governance, Regulation and Bank Stability / ed. by T. Lindblom, S. Sjögren, M. Willesson. – Basingstoke: Palgrave Macmillan, 2014. – P. 92–95.</w:t>
+        <w:t xml:space="preserve">Thakor A.V. Leverage, System Risk and Financial System Health: How Do We Develop a Healthy Financial System? // Governance, Regulation and Bank Stability / ed. by T. Lindblom, S. Sjögren, M. Willesson. – Basingstoke: Palgrave Macmillan, 2014. – P. 10–12.</w:t>
       </w:r>
     </w:p>
   </w:footnote>
@@ -6759,7 +7046,7 @@
         <w:t xml:space="preserve"> </w:t>
       </w:r>
       <w:r>
-        <w:t xml:space="preserve">Chiaramonte L., Poli F. Predicting European Bank Distress: Evidence from the Recent Financial Crisis // Governance, Regulation and Bank Stability / ed. by T. Lindblom, S. Sjögren, M. Willesson. – Basingstoke: Palgrave Macmillan, 2014. – P. 83–95.</w:t>
+        <w:t xml:space="preserve">Tarullo D.K. Banking on Basel: The Future of International Financial Regulation. – Washington, DC: Peterson Institute for International Economics, 2008. – P. 16.</w:t>
       </w:r>
     </w:p>
   </w:footnote>
@@ -6778,7 +7065,7 @@
         <w:t xml:space="preserve"> </w:t>
       </w:r>
       <w:r>
-        <w:t xml:space="preserve">Borio C. Towards a Macroprudential Framework for Financial Supervision and Regulation?: BIS Working Papers No. 128. – Basel: Bank for International Settlements, 2003. – 32 p.</w:t>
+        <w:t xml:space="preserve">Merton R.C. On the Pricing of Corporate Debt: The Risk Structure of Interest Rates // Journal of Finance. – 1974. – Vol. 29, No. 2. – P. 449–470.</w:t>
       </w:r>
     </w:p>
   </w:footnote>
@@ -6797,7 +7084,7 @@
         <w:t xml:space="preserve"> </w:t>
       </w:r>
       <w:r>
-        <w:t xml:space="preserve">Adrian T., Brunnermeier M.K. CoVaR // American Economic Review. – 2016. – Vol. 106, No. 7. – P. 1705–1741.</w:t>
+        <w:t xml:space="preserve">Roy A.D. Safety First and the Holding of Assets // Econometrica. – 1952. – Vol. 20, No. 3. – P. 431–449.</w:t>
       </w:r>
     </w:p>
   </w:footnote>
@@ -6816,7 +7103,7 @@
         <w:t xml:space="preserve"> </w:t>
       </w:r>
       <w:r>
-        <w:t xml:space="preserve">Регулирование банковской сферы: учебник / под ред. О.Н. Афанасьевой, С.Е. Дубовой. – М.: КНОРУС. – С. 55–62.</w:t>
+        <w:t xml:space="preserve">Boyd J.H., Graham S.L. Risk, Regulation, and Bank Holding Company Expansion into Nonbanking // Federal Reserve Bank of Minneapolis Quarterly Review. – 1986. – Vol. 10, No. 2. – P. 2–17.</w:t>
       </w:r>
     </w:p>
   </w:footnote>
@@ -6835,7 +7122,7 @@
         <w:t xml:space="preserve"> </w:t>
       </w:r>
       <w:r>
-        <w:t xml:space="preserve">IFRS 9 Financial Instruments. – London: International Accounting Standards Board, 2014.</w:t>
+        <w:t xml:space="preserve">Tadqiqot natijasida muallif tomonidan quyidagi manba ma’lumotlari asosida ishlab chiqildi: Chiaramonte L., Poli F. Predicting European Bank Distress: Evidence from the Recent Financial Crisis // Governance, Regulation and Bank Stability / ed. by T. Lindblom, S. Sjögren, M. Willesson. – Basingstoke: Palgrave Macmillan, 2014. – P. 92–95.</w:t>
       </w:r>
     </w:p>
   </w:footnote>
@@ -6854,11 +7141,106 @@
         <w:t xml:space="preserve"> </w:t>
       </w:r>
       <w:r>
-        <w:t xml:space="preserve">Tadqiqot natijasida muallif tomonidan quyidagi manbalar asosida ishlab chiqildi: Diamond D.W., Dybvig P.H. Bank Runs, Deposit Insurance, and Liquidity // Journal of Political Economy. – 1983. – Vol. 91, No. 3. – P. 401–419; Minsky H.P. The Financial Instability Hypothesis: Working Paper No. 74. – Annandale-on-Hudson: The Jerome Levy Economics Institute of Bard College, 1992. – 10 p; Tarullo D.K. Banking on Basel: The Future of International Financial Regulation. – Washington, DC: Peterson Institute for International Economics, 2008. – P. 16; Merton R.C. On the Pricing of Corporate Debt: The Risk Structure of Interest Rates // Journal of Finance. – 1974. – Vol. 29, No. 2. – P. 449–470; Boyd J.H., Graham S.L. Risk, Regulation, and Bank Holding Company Expansion into Nonbanking // Federal Reserve Bank of Minneapolis Quarterly Review. – 1986. – Vol. 10, No. 2. – P. 2–17; Borio C. Towards a Macroprudential Framework for Financial Supervision and Regulation?: BIS Working Papers No. 128. – Basel: Bank for International Settlements, 2003. – 32 p; Adrian T., Brunnermeier M.K. CoVaR // American Economic Review. – 2016. – Vol. 106, No. 7. – P. 1705–1741; IFRS 9 Financial Instruments. – London: International Accounting Standards Board, 2014.</w:t>
+        <w:t xml:space="preserve">Chiaramonte L., Poli F. Predicting European Bank Distress: Evidence from the Recent Financial Crisis // Governance, Regulation and Bank Stability / ed. by T. Lindblom, S. Sjögren, M. Willesson. – Basingstoke: Palgrave Macmillan, 2014. – P. 83–95.</w:t>
       </w:r>
     </w:p>
   </w:footnote>
   <w:footnote w:id="62">
+    <w:p>
+      <w:pPr>
+        <w:pStyle w:val="FootnoteText"/>
+      </w:pPr>
+      <w:r>
+        <w:rPr>
+          <w:rStyle w:val="FootnoteReference"/>
+        </w:rPr>
+        <w:footnoteRef/>
+      </w:r>
+      <w:r>
+        <w:t xml:space="preserve"> </w:t>
+      </w:r>
+      <w:r>
+        <w:t xml:space="preserve">Borio C. Towards a Macroprudential Framework for Financial Supervision and Regulation?: BIS Working Papers No. 128. – Basel: Bank for International Settlements, 2003. – 32 p.</w:t>
+      </w:r>
+    </w:p>
+  </w:footnote>
+  <w:footnote w:id="63">
+    <w:p>
+      <w:pPr>
+        <w:pStyle w:val="FootnoteText"/>
+      </w:pPr>
+      <w:r>
+        <w:rPr>
+          <w:rStyle w:val="FootnoteReference"/>
+        </w:rPr>
+        <w:footnoteRef/>
+      </w:r>
+      <w:r>
+        <w:t xml:space="preserve"> </w:t>
+      </w:r>
+      <w:r>
+        <w:t xml:space="preserve">Adrian T., Brunnermeier M.K. CoVaR // American Economic Review. – 2016. – Vol. 106, No. 7. – P. 1705–1741.</w:t>
+      </w:r>
+    </w:p>
+  </w:footnote>
+  <w:footnote w:id="64">
+    <w:p>
+      <w:pPr>
+        <w:pStyle w:val="FootnoteText"/>
+      </w:pPr>
+      <w:r>
+        <w:rPr>
+          <w:rStyle w:val="FootnoteReference"/>
+        </w:rPr>
+        <w:footnoteRef/>
+      </w:r>
+      <w:r>
+        <w:t xml:space="preserve"> </w:t>
+      </w:r>
+      <w:r>
+        <w:t xml:space="preserve">Регулирование банковской сферы: учебник / под ред. О.Н. Афанасьевой, С.Е. Дубовой. – М.: КНОРУС. – С. 55–62.</w:t>
+      </w:r>
+    </w:p>
+  </w:footnote>
+  <w:footnote w:id="65">
+    <w:p>
+      <w:pPr>
+        <w:pStyle w:val="FootnoteText"/>
+      </w:pPr>
+      <w:r>
+        <w:rPr>
+          <w:rStyle w:val="FootnoteReference"/>
+        </w:rPr>
+        <w:footnoteRef/>
+      </w:r>
+      <w:r>
+        <w:t xml:space="preserve"> </w:t>
+      </w:r>
+      <w:r>
+        <w:t xml:space="preserve">IFRS 9 Financial Instruments. – London: International Accounting Standards Board, 2014.</w:t>
+      </w:r>
+    </w:p>
+  </w:footnote>
+  <w:footnote w:id="66">
+    <w:p>
+      <w:pPr>
+        <w:pStyle w:val="FootnoteText"/>
+      </w:pPr>
+      <w:r>
+        <w:rPr>
+          <w:rStyle w:val="FootnoteReference"/>
+        </w:rPr>
+        <w:footnoteRef/>
+      </w:r>
+      <w:r>
+        <w:t xml:space="preserve"> </w:t>
+      </w:r>
+      <w:r>
+        <w:t xml:space="preserve">Tadqiqot natijasida muallif tomonidan quyidagi manbalar asosida ishlab chiqildi: Diamond D.W., Dybvig P.H. Bank Runs, Deposit Insurance, and Liquidity // Journal of Political Economy. – 1983. – Vol. 91, No. 3. – P. 401–419; Minsky H.P. The Financial Instability Hypothesis: Working Paper No. 74. – Annandale-on-Hudson: The Jerome Levy Economics Institute of Bard College, 1992. – 10 p; Tarullo D.K. Banking on Basel: The Future of International Financial Regulation. – Washington, DC: Peterson Institute for International Economics, 2008. – P. 16; Merton R.C. On the Pricing of Corporate Debt: The Risk Structure of Interest Rates // Journal of Finance. – 1974. – Vol. 29, No. 2. – P. 449–470; Boyd J.H., Graham S.L. Risk, Regulation, and Bank Holding Company Expansion into Nonbanking // Federal Reserve Bank of Minneapolis Quarterly Review. – 1986. – Vol. 10, No. 2. – P. 2–17; Borio C. Towards a Macroprudential Framework for Financial Supervision and Regulation?: BIS Working Papers No. 128. – Basel: Bank for International Settlements, 2003. – 32 p; Adrian T., Brunnermeier M.K. CoVaR // American Economic Review. – 2016. – Vol. 106, No. 7. – P. 1705–1741; IFRS 9 Financial Instruments. – London: International Accounting Standards Board, 2014.</w:t>
+      </w:r>
+    </w:p>
+  </w:footnote>
+  <w:footnote w:id="67">
     <w:p>
       <w:pPr>
         <w:pStyle w:val="FootnoteText"/>

</xml_diff>

<commit_message>
1.1-§ va Kirish: xorijiy (Houben–Kakes–Schinasi, Čihák, ECB) va MDH (Fetisov, Gerasimova, Larionova, Ivanov, Timofeeva) olimlari qo‘shildi
Co-Authored-By: Claude Opus 5.5 <noreply@anthropic.com>
Claude-Session: https://claude.ai/code/session_01PxHTC8Q7yHdrpAeUA5KUgM
</commit_message>
<xml_diff>
--- a/paragraflar/1.1-paragraf.docx
+++ b/paragraflar/1.1-paragraf.docx
@@ -2,7 +2,7 @@
 <file path=word/document.xml><?xml version="1.0" encoding="utf-8"?>
 <w:document xmlns:w="http://schemas.openxmlformats.org/wordprocessingml/2006/main" xmlns:m="http://schemas.openxmlformats.org/officeDocument/2006/math" xmlns:r="http://schemas.openxmlformats.org/officeDocument/2006/relationships" xmlns:o="urn:schemas-microsoft-com:office:office" xmlns:v="urn:schemas-microsoft-com:vml" xmlns:w10="urn:schemas-microsoft-com:office:word" xmlns:a="http://schemas.openxmlformats.org/drawingml/2006/main" xmlns:pic="http://schemas.openxmlformats.org/drawingml/2006/picture" xmlns:wp="http://schemas.openxmlformats.org/drawingml/2006/wordprocessingDrawing">
   <w:body>
-    <w:bookmarkStart w:id="68" w:name="X3bc3af2dd64aa3d859b43cc63eba0df007461c7"/>
+    <w:bookmarkStart w:id="74" w:name="X3bc3af2dd64aa3d859b43cc63eba0df007461c7"/>
     <w:p>
       <w:pPr>
         <w:pStyle w:val="Heading2"/>
@@ -1458,6 +1458,183 @@
                 <w:rFonts w:ascii="Times New Roman" w:hAnsi="Times New Roman" w:cs="Times New Roman" w:eastAsia="Times New Roman"/>
                 <w:sz w:val="22"/>
               </w:rPr>
+              <w:t xml:space="preserve">G.G. Fetisov</w:t>
+            </w:r>
+          </w:p>
+        </w:tc>
+        <w:tc>
+          <w:tcPr/>
+          <w:p>
+            <w:pPr>
+              <w:pStyle w:val="Compact"/>
+              <w:spacing w:line="240" w:lineRule="auto"/>
+              <w:ind w:firstLine="0"/>
+              <w:jc w:val="left"/>
+            </w:pPr>
+            <w:r>
+              <w:rPr>
+                <w:rFonts w:ascii="Times New Roman" w:hAnsi="Times New Roman" w:cs="Times New Roman" w:eastAsia="Times New Roman"/>
+                <w:sz w:val="22"/>
+              </w:rPr>
+              <w:t xml:space="preserve">Bankning o‘zgaruvchan tashqi va ichki omillar sharoitida mijozlar, kreditorlar va omonatchilar oldidagi majburiyatlarini bajarish qobiliyati</w:t>
+            </w:r>
+          </w:p>
+        </w:tc>
+        <w:tc>
+          <w:tcPr/>
+          <w:p>
+            <w:pPr>
+              <w:pStyle w:val="Compact"/>
+              <w:spacing w:line="240" w:lineRule="auto"/>
+              <w:ind w:firstLine="0"/>
+              <w:jc w:val="left"/>
+            </w:pPr>
+            <w:r>
+              <w:rPr>
+                <w:rFonts w:ascii="Times New Roman" w:hAnsi="Times New Roman" w:cs="Times New Roman" w:eastAsia="Times New Roman"/>
+                <w:sz w:val="22"/>
+              </w:rPr>
+              <w:t xml:space="preserve">Muvozanat va majburiyatlarni bajarish</w:t>
+            </w:r>
+          </w:p>
+        </w:tc>
+      </w:tr>
+      <w:tr>
+        <w:trPr>
+          <w:cantSplit/>
+        </w:trPr>
+        <w:tc>
+          <w:tcPr/>
+          <w:p>
+            <w:pPr>
+              <w:pStyle w:val="Compact"/>
+              <w:spacing w:line="240" w:lineRule="auto"/>
+              <w:ind w:firstLine="0"/>
+              <w:jc w:val="left"/>
+            </w:pPr>
+            <w:r>
+              <w:rPr>
+                <w:rFonts w:ascii="Times New Roman" w:hAnsi="Times New Roman" w:cs="Times New Roman" w:eastAsia="Times New Roman"/>
+                <w:sz w:val="22"/>
+              </w:rPr>
+              <w:t xml:space="preserve">I.V. Larionova</w:t>
+            </w:r>
+          </w:p>
+        </w:tc>
+        <w:tc>
+          <w:tcPr/>
+          <w:p>
+            <w:pPr>
+              <w:pStyle w:val="Compact"/>
+              <w:spacing w:line="240" w:lineRule="auto"/>
+              <w:ind w:firstLine="0"/>
+              <w:jc w:val="left"/>
+            </w:pPr>
+            <w:r>
+              <w:rPr>
+                <w:rFonts w:ascii="Times New Roman" w:hAnsi="Times New Roman" w:cs="Times New Roman" w:eastAsia="Times New Roman"/>
+                <w:sz w:val="22"/>
+              </w:rPr>
+              <w:t xml:space="preserve">Ichki va tashqi ta’sirlarga qarshi turish, uzoq davr davomida barqaror muvozanat va ishonchlilikni saqlash qobiliyati</w:t>
+            </w:r>
+          </w:p>
+        </w:tc>
+        <w:tc>
+          <w:tcPr/>
+          <w:p>
+            <w:pPr>
+              <w:pStyle w:val="Compact"/>
+              <w:spacing w:line="240" w:lineRule="auto"/>
+              <w:ind w:firstLine="0"/>
+              <w:jc w:val="left"/>
+            </w:pPr>
+            <w:r>
+              <w:rPr>
+                <w:rFonts w:ascii="Times New Roman" w:hAnsi="Times New Roman" w:cs="Times New Roman" w:eastAsia="Times New Roman"/>
+                <w:sz w:val="22"/>
+              </w:rPr>
+              <w:t xml:space="preserve">Uzoq muddatli muvozanat</w:t>
+            </w:r>
+          </w:p>
+        </w:tc>
+      </w:tr>
+      <w:tr>
+        <w:trPr>
+          <w:cantSplit/>
+        </w:trPr>
+        <w:tc>
+          <w:tcPr/>
+          <w:p>
+            <w:pPr>
+              <w:pStyle w:val="Compact"/>
+              <w:spacing w:line="240" w:lineRule="auto"/>
+              <w:ind w:firstLine="0"/>
+              <w:jc w:val="left"/>
+            </w:pPr>
+            <w:r>
+              <w:rPr>
+                <w:rFonts w:ascii="Times New Roman" w:hAnsi="Times New Roman" w:cs="Times New Roman" w:eastAsia="Times New Roman"/>
+                <w:sz w:val="22"/>
+              </w:rPr>
+              <w:t xml:space="preserve">A. Houben, J. Kakes, G. Schinasi</w:t>
+            </w:r>
+          </w:p>
+        </w:tc>
+        <w:tc>
+          <w:tcPr/>
+          <w:p>
+            <w:pPr>
+              <w:pStyle w:val="Compact"/>
+              <w:spacing w:line="240" w:lineRule="auto"/>
+              <w:ind w:firstLine="0"/>
+              <w:jc w:val="left"/>
+            </w:pPr>
+            <w:r>
+              <w:rPr>
+                <w:rFonts w:ascii="Times New Roman" w:hAnsi="Times New Roman" w:cs="Times New Roman" w:eastAsia="Times New Roman"/>
+                <w:sz w:val="22"/>
+              </w:rPr>
+              <w:t xml:space="preserve">Resurslarni samarali taqsimlash, risklarni boshqarish va shoklarni yutish qobiliyati ko‘p o‘lchovli «barqarorlik yo‘lagi» doirasida</w:t>
+            </w:r>
+          </w:p>
+        </w:tc>
+        <w:tc>
+          <w:tcPr/>
+          <w:p>
+            <w:pPr>
+              <w:pStyle w:val="Compact"/>
+              <w:spacing w:line="240" w:lineRule="auto"/>
+              <w:ind w:firstLine="0"/>
+              <w:jc w:val="left"/>
+            </w:pPr>
+            <w:r>
+              <w:rPr>
+                <w:rFonts w:ascii="Times New Roman" w:hAnsi="Times New Roman" w:cs="Times New Roman" w:eastAsia="Times New Roman"/>
+                <w:sz w:val="22"/>
+              </w:rPr>
+              <w:t xml:space="preserve">Mezoniy chegaralar (yo‘lak)</w:t>
+            </w:r>
+          </w:p>
+        </w:tc>
+      </w:tr>
+      <w:tr>
+        <w:trPr>
+          <w:cantSplit/>
+        </w:trPr>
+        <w:tc>
+          <w:tcPr/>
+          <w:p>
+            <w:pPr>
+              <w:pStyle w:val="Compact"/>
+              <w:spacing w:line="240" w:lineRule="auto"/>
+              <w:ind w:firstLine="0"/>
+              <w:jc w:val="left"/>
+            </w:pPr>
+            <w:r>
+              <w:rPr>
+                <w:rFonts w:ascii="Times New Roman" w:hAnsi="Times New Roman" w:cs="Times New Roman" w:eastAsia="Times New Roman"/>
+                <w:sz w:val="22"/>
+              </w:rPr>
               <w:t xml:space="preserve">O.B. Sattarov</w:t>
             </w:r>
           </w:p>
@@ -1730,7 +1907,7 @@
           <w:rFonts w:ascii="Times New Roman" w:hAnsi="Times New Roman" w:cs="Times New Roman" w:eastAsia="Times New Roman"/>
           <w:sz w:val="28"/>
         </w:rPr>
-        <w:t xml:space="preserve">G‘arb adabiyotida esa moliyaviy barqarorlik ko‘proq tizim darajasida va funksional nuqtai nazardan talqin qilinadi. G.J. Schinasi moliyaviy barqarorlikni moliya tizimining iqtisodiy resurslarni samarali taqsimlash, moliyaviy risklarni baholash va boshqarish hamda shoklarni yutish qobiliyati sifatida ta’riflaydi va uni ikki holat orasidagi uzluksiz chiziq, ya’ni «kontinuum» deb qaraydi</w:t>
+        <w:t xml:space="preserve">Rossiya iqtisodiy maktabining boshqa vakillari ham bu tushunchani turlicha talqin qiladi. G.G. Fetisov barqarorlikni muvozanat nuqtai nazaridan qarab, bankning o‘zgaruvchan tashqi va ichki omillar ta’siri sharoitida mijozlar, kreditorlar va omonatchilar oldidagi majburiyatlarini bajarish qobiliyati sifatida ta’riflaydi, Ye.B. Gerasimova esa «barqarorlik» va «ishonchlilik» kategoriyalarini aynan bir xil deb hisoblab, ularni turg‘unlik emas, balki barqaror rivojlanish holati, ya’ni «harakatdagi muvozanatning sifat holati» deb belgilaydi</w:t>
       </w:r>
       <w:r>
         <w:rPr>
@@ -1743,7 +1920,7 @@
           <w:rFonts w:ascii="Times New Roman" w:hAnsi="Times New Roman" w:cs="Times New Roman" w:eastAsia="Times New Roman"/>
           <w:sz w:val="28"/>
         </w:rPr>
-        <w:t xml:space="preserve">. F.S. Mishkin esa beqarorlikdan kelib chiqib, uni axborot oqimining keskin uzilishi natijasida moliya tizimi mablag‘larni eng samarali investitsiya imkoniyatlariga yo‘naltira olmay qoladigan holat sifatida izohlaydi</w:t>
+        <w:t xml:space="preserve">. I.V. Larionova moliyaviy barqarorlikni ichki va tashqi ta’sirlarga qarshi turish, uzoq vaqt davomida barqaror muvozanat va ishonchlilikni saqlash qobiliyati sifatida, V.V. Ivanov esa bank faoliyatining o‘rta va uzoq muddatli istiqboldagi barqarorligi sifatida ta’riflaydi</w:t>
       </w:r>
       <w:r>
         <w:rPr>
@@ -1756,7 +1933,7 @@
           <w:rFonts w:ascii="Times New Roman" w:hAnsi="Times New Roman" w:cs="Times New Roman" w:eastAsia="Times New Roman"/>
           <w:sz w:val="28"/>
         </w:rPr>
-        <w:t xml:space="preserve">. J.M. Hendrickson ta’rifida esa asosiy o‘rinni ishonch egallaydi: muallif fikricha, beqarorlikning kaliti iste’molchilar ishonchining kutilmaganda keskin yo‘qolishidir. U yana bir muhim fikrni ilgari suradi: bank inqirozi har doim moliyaviy beqarorlikka olib keladi, biroq moliyaviy beqarorlik bank inqirozisiz ham yuzaga kelishi mumkin</w:t>
+        <w:t xml:space="preserve">. Z.A. Timofeeva mavjud ta’riflarni tizimlashtirib, ularni besh yo‘nalishga ajratadi: moliyaviy ko‘rsatkichlarning mezoniy qiymatlariga mos kelish, resurslar va risklarni transformatsiya qilish tizimining dinamik kategoriyasi, likvidlik va to‘lovga qobiliyatlilik bilan tenglashtirish, daromadlilik bilan tenglashtirish hamda bankning umumiy barqarorligining tarkibiy qismi. Muallif birinchi yo‘nalishni tanqid qilib, moliyaviy barqarorlikni faqat me’yoriy ko‘rsatkichlarga mos kelish bilan belgilash uni statik holatda, ya’ni ko‘rsatkichlar to‘plami doirasida tushunish ekanini ta’kidlaydi</w:t>
       </w:r>
       <w:r>
         <w:rPr>
@@ -1769,7 +1946,7 @@
           <w:rFonts w:ascii="Times New Roman" w:hAnsi="Times New Roman" w:cs="Times New Roman" w:eastAsia="Times New Roman"/>
           <w:sz w:val="28"/>
         </w:rPr>
-        <w:t xml:space="preserve">.</w:t>
+        <w:t xml:space="preserve">. Bu fikr muhim xulosaga olib keladi: me’yoriy ko‘rsatkichlar barqarorlikning yetarli emas, balki zaruriy mezoni bo‘lib, ularni dinamika va risk omillari bilan to‘ldirish talab etiladi.</w:t>
       </w:r>
     </w:p>
     <w:p>
@@ -1784,7 +1961,7 @@
           <w:rFonts w:ascii="Times New Roman" w:hAnsi="Times New Roman" w:cs="Times New Roman" w:eastAsia="Times New Roman"/>
           <w:sz w:val="28"/>
         </w:rPr>
-        <w:t xml:space="preserve">Mahalliy iqtisodchi olimlar ham moliyaviy barqarorlik tushunchasini turli nuqtai nazardan talqin qilgan. O.B. Sattarov avvalo «barqarorlik» kategoriyasining o‘zini tahlil qilib, uni statik holat emas, balki dinamik jarayon, ya’ni erishilgan darajani saqlagan holda rivojlanishga intilish sifatida qaraydi va shu asosda bank tizimi barqarorligini «Markaziy bank va tijorat banklari faoliyati davomida o‘z funksiyalarini to‘laqonli bajara olishini ta’minlash imkonini beradigan darajani saqlagan holatda, rivojlanishga qarab intilish» deb ta’riflaydi</w:t>
+        <w:t xml:space="preserve">G‘arb adabiyotida esa moliyaviy barqarorlik ko‘proq tizim darajasida va funksional nuqtai nazardan talqin qilinadi. G.J. Schinasi moliyaviy barqarorlikni moliya tizimining iqtisodiy resurslarni samarali taqsimlash, moliyaviy risklarni baholash va boshqarish hamda shoklarni yutish qobiliyati sifatida ta’riflaydi va uni ikki holat orasidagi uzluksiz chiziq, ya’ni «kontinuum» deb qaraydi</w:t>
       </w:r>
       <w:r>
         <w:rPr>
@@ -1797,13 +1974,26 @@
           <w:rFonts w:ascii="Times New Roman" w:hAnsi="Times New Roman" w:cs="Times New Roman" w:eastAsia="Times New Roman"/>
           <w:sz w:val="28"/>
         </w:rPr>
-        <w:t xml:space="preserve">. R.X. Bozorov esa moliyaviy barqarorlikni ikki darajada ko‘rib chiqadi: mikrodarajada u bankning har qanday sharoitda mijozlar oldidagi vazifalarini bajarishda faoliyatining hayotiyligi va davomiyligini ta’minlashni, makrodarajada esa bank tizimining turli iqtisodiy qiyinchiliklarning oldini olishi va tizim barqarorligini ta’minlashini anglatadi</w:t>
+        <w:t xml:space="preserve">. F.S. Mishkin esa beqarorlikdan kelib chiqib, uni axborot oqimining keskin uzilishi natijasida moliya tizimi mablag‘larni eng samarali investitsiya imkoniyatlariga yo‘naltira olmay qoladigan holat sifatida izohlaydi</w:t>
       </w:r>
       <w:r>
         <w:rPr>
           <w:rStyle w:val="FootnoteReference"/>
         </w:rPr>
         <w:footnoteReference w:id="32"/>
+      </w:r>
+      <w:r>
+        <w:rPr>
+          <w:rFonts w:ascii="Times New Roman" w:hAnsi="Times New Roman" w:cs="Times New Roman" w:eastAsia="Times New Roman"/>
+          <w:sz w:val="28"/>
+        </w:rPr>
+        <w:t xml:space="preserve">. J.M. Hendrickson ta’rifida esa asosiy o‘rinni ishonch egallaydi: muallif fikricha, beqarorlikning kaliti iste’molchilar ishonchining kutilmaganda keskin yo‘qolishidir. U yana bir muhim fikrni ilgari suradi: bank inqirozi har doim moliyaviy beqarorlikka olib keladi, biroq moliyaviy beqarorlik bank inqirozisiz ham yuzaga kelishi mumkin</w:t>
+      </w:r>
+      <w:r>
+        <w:rPr>
+          <w:rStyle w:val="FootnoteReference"/>
+        </w:rPr>
+        <w:footnoteReference w:id="33"/>
       </w:r>
       <w:r>
         <w:rPr>
@@ -1825,46 +2015,46 @@
           <w:rFonts w:ascii="Times New Roman" w:hAnsi="Times New Roman" w:cs="Times New Roman" w:eastAsia="Times New Roman"/>
           <w:sz w:val="28"/>
         </w:rPr>
-        <w:t xml:space="preserve">Keyingi yillardagi tadqiqotlarda ta’riflarning urg‘usi sezilarli darajada o‘zgargan. I.G. Sadikov ta’rifida bozor mavqei va daromadlilik birinchi o‘ringa chiqadi: muallif moliyaviy barqarorlikni bankning foyda olish jarayonida moliyaviy ko‘rsatkichlari va faoliyatining ijobiy holatini ta’minlagan holda bank xizmatlari bozorida o‘z mavqeini mustahkamlash orqali ichki va tashqi muhitning salbiy oqibatlariga qarshi tura olish qobiliyati sifatida ta’riflaydi</w:t>
-      </w:r>
-      <w:r>
-        <w:rPr>
-          <w:rStyle w:val="FootnoteReference"/>
-        </w:rPr>
-        <w:footnoteReference w:id="33"/>
+        <w:t xml:space="preserve">G.J. Schinasi g‘oyasi A. Houben, J. Kakes va G. Schinasi ishida yanada rivojlantirilgan. Mualliflar moliyaviy barqarorlikni moliya tizimi resurslarni faoliyat turlari va vaqt bo‘yicha samarali taqsimlay oladigan, moliyaviy risklarni baholab boshqara oladigan va shoklarni yuta oladigan holat sifatida ta’riflab, bu holat ko‘p o‘lchovli «barqarorlik yo‘lagi» doirasida kechishini ko‘rsatadi: masalan, foiz spredlari tebranuvchanligi va bank tizimi kapitalining ayrim kombinatsiyalari barqarorlikka mos keladi, boshqalari esa bu yo‘lakdan tashqarida bo‘ladi</w:t>
+      </w:r>
+      <w:r>
+        <w:rPr>
+          <w:rStyle w:val="FootnoteReference"/>
+        </w:rPr>
+        <w:footnoteReference w:id="34"/>
       </w:r>
       <w:r>
         <w:rPr>
           <w:rFonts w:ascii="Times New Roman" w:hAnsi="Times New Roman" w:cs="Times New Roman" w:eastAsia="Times New Roman"/>
           <w:sz w:val="28"/>
         </w:rPr>
-        <w:t xml:space="preserve">. B.A. Madaminov esa barqarorlikni likvidlik va to‘lovga qobiliyatlilik bilan tenglashtiruvchi yondashuvni statik deb tanqid qilib, uni bankning nafaqat muayyan vaqtda majburiyatlarni bajarish, balki endogen va ekzogen shoklarni yutib, faoliyatni to‘xtatmasdan muvozanatni tiklash salohiyatini aks ettiruvchi dinamik xususiyat sifatida belgilaydi</w:t>
-      </w:r>
-      <w:r>
-        <w:rPr>
-          <w:rStyle w:val="FootnoteReference"/>
-        </w:rPr>
-        <w:footnoteReference w:id="34"/>
+        <w:t xml:space="preserve">. Yevropa Markaziy banki ham moliyaviy barqarorlikni moliyaviy vositachilar, bozorlar va bozor infratuzilmasidan iborat moliya tizimining shoklarga va moliyaviy nomutanosibliklarning yechilishiga bardosh bera olishi bilan ta’riflaydi</w:t>
+      </w:r>
+      <w:r>
+        <w:rPr>
+          <w:rStyle w:val="FootnoteReference"/>
+        </w:rPr>
+        <w:footnoteReference w:id="35"/>
       </w:r>
       <w:r>
         <w:rPr>
           <w:rFonts w:ascii="Times New Roman" w:hAnsi="Times New Roman" w:cs="Times New Roman" w:eastAsia="Times New Roman"/>
           <w:sz w:val="28"/>
         </w:rPr>
-        <w:t xml:space="preserve">. Sh.Sh. Abdishukurov likvidlik, kapital yetarliligi va rentabellikni «moliyaviy barqarorlik uchburchagi» sifatida qarab, barqarorlikni bitta ko‘rsatkichni optimal darajada ushlab turish emas, balki shu ko‘rsatkichlar o‘rtasidagi muvozanatni ta’minlash qobiliyati deb hisoblaydi</w:t>
-      </w:r>
-      <w:r>
-        <w:rPr>
-          <w:rStyle w:val="FootnoteReference"/>
-        </w:rPr>
-        <w:footnoteReference w:id="35"/>
+        <w:t xml:space="preserve">. M. Čihák esa 2006-yilda markaziy banklarning moliyaviy barqarorlik sharhlarini tahlil qilib, ularning aksariyatida barqarorlik juda umumiy tarzda ta’riflanganini aniqlagan va moliyaviy barqarorlikni nafaqat umumiy, balki kuzatiladigan asosiy ko‘rsatkichlarni aniq ko‘rsatuvchi «operatsion» ta’rif bilan ham belgilash zarurligini asoslagan</w:t>
+      </w:r>
+      <w:r>
+        <w:rPr>
+          <w:rStyle w:val="FootnoteReference"/>
+        </w:rPr>
+        <w:footnoteReference w:id="36"/>
       </w:r>
       <w:r>
         <w:rPr>
           <w:rFonts w:ascii="Times New Roman" w:hAnsi="Times New Roman" w:cs="Times New Roman" w:eastAsia="Times New Roman"/>
           <w:sz w:val="28"/>
         </w:rPr>
-        <w:t xml:space="preserve">.</w:t>
+        <w:t xml:space="preserve">. Bu talab baholash metodologiyasi uchun muhim ahamiyatga ega, chunki barqarorlikning umumiy ta’rifi uni o‘lchash usulini belgilab bermaydi.</w:t>
       </w:r>
     </w:p>
     <w:p>
@@ -1879,20 +2069,33 @@
           <w:rFonts w:ascii="Times New Roman" w:hAnsi="Times New Roman" w:cs="Times New Roman" w:eastAsia="Times New Roman"/>
           <w:sz w:val="28"/>
         </w:rPr>
-        <w:t xml:space="preserve">N.H. Sharipova tijorat banki moliyaviy barqarorligini bankning o‘z funksiyalarini beqaror iqtisodiy sharoitlarda ham uzluksiz va samarali bajarish qobiliyatini ta’minlaydigan, moliyaviy resurslar, kapital va likvidlikni optimal boshqarish orqali barqaror rivojlanishga erishadigan tizimli va dinamik holat sifatida ta’riflaydi</w:t>
-      </w:r>
-      <w:r>
-        <w:rPr>
-          <w:rStyle w:val="FootnoteReference"/>
-        </w:rPr>
-        <w:footnoteReference w:id="36"/>
+        <w:t xml:space="preserve">Mahalliy iqtisodchi olimlar ham moliyaviy barqarorlik tushunchasini turli nuqtai nazardan talqin qilgan. O.B. Sattarov avvalo «barqarorlik» kategoriyasining o‘zini tahlil qilib, uni statik holat emas, balki dinamik jarayon, ya’ni erishilgan darajani saqlagan holda rivojlanishga intilish sifatida qaraydi va shu asosda bank tizimi barqarorligini «Markaziy bank va tijorat banklari faoliyati davomida o‘z funksiyalarini to‘laqonli bajara olishini ta’minlash imkonini beradigan darajani saqlagan holatda, rivojlanishga qarab intilish» deb ta’riflaydi</w:t>
+      </w:r>
+      <w:r>
+        <w:rPr>
+          <w:rStyle w:val="FootnoteReference"/>
+        </w:rPr>
+        <w:footnoteReference w:id="37"/>
       </w:r>
       <w:r>
         <w:rPr>
           <w:rFonts w:ascii="Times New Roman" w:hAnsi="Times New Roman" w:cs="Times New Roman" w:eastAsia="Times New Roman"/>
           <w:sz w:val="28"/>
         </w:rPr>
-        <w:t xml:space="preserve">. Bu ta’rifda uzluksizlik va dinamikaga urg‘u berilgani e’tiborga loyiq.</w:t>
+        <w:t xml:space="preserve">. R.X. Bozorov esa moliyaviy barqarorlikni ikki darajada ko‘rib chiqadi: mikrodarajada u bankning har qanday sharoitda mijozlar oldidagi vazifalarini bajarishda faoliyatining hayotiyligi va davomiyligini ta’minlashni, makrodarajada esa bank tizimining turli iqtisodiy qiyinchiliklarning oldini olishi va tizim barqarorligini ta’minlashini anglatadi</w:t>
+      </w:r>
+      <w:r>
+        <w:rPr>
+          <w:rStyle w:val="FootnoteReference"/>
+        </w:rPr>
+        <w:footnoteReference w:id="38"/>
+      </w:r>
+      <w:r>
+        <w:rPr>
+          <w:rFonts w:ascii="Times New Roman" w:hAnsi="Times New Roman" w:cs="Times New Roman" w:eastAsia="Times New Roman"/>
+          <w:sz w:val="28"/>
+        </w:rPr>
+        <w:t xml:space="preserve">.</w:t>
       </w:r>
     </w:p>
     <w:p>
@@ -1907,7 +2110,46 @@
           <w:rFonts w:ascii="Times New Roman" w:hAnsi="Times New Roman" w:cs="Times New Roman" w:eastAsia="Times New Roman"/>
           <w:sz w:val="28"/>
         </w:rPr>
-        <w:t xml:space="preserve">Mahalliy olimlarning ta’riflarini umumlashtirish shuni ko‘rsatadiki, ularda ikki umumiy jihat kuzatiladi. Birinchidan, deyarli barcha mualliflar barqarorlikning dinamik tabiatini ta’kidlaydi va uni muayyan sanadagi holat bilan emas, balki shoklarga bardosh berish va rivojlanishni davom ettirish qobiliyati bilan bog‘laydi. Ikkinchidan, ta’riflarning birortasida ham barqarorlikni qaysi me’yorlar va qaysi hisobot standarti asosida o‘lchash kerakligi, ya’ni uning miqdoriy chegaralari aniq ko‘rsatilmagan. Bu masala amaliy ahamiyatga ega, chunki ikkinchi bobda ko‘rsatilganidek, bir xil bankning aktivlar sifati milliy hisobot va MHXS bo‘yicha bir necha barobar farq qiladigan natija berishi mumkin. Demak, moliyaviy barqarorlik ta’rifi uning xalqaro standartlarda belgilangan chegaralarga nisbatan o‘lchanishini ham nazarda tutishi lozim.</w:t>
+        <w:t xml:space="preserve">Keyingi yillardagi tadqiqotlarda ta’riflarning urg‘usi sezilarli darajada o‘zgargan. I.G. Sadikov ta’rifida bozor mavqei va daromadlilik birinchi o‘ringa chiqadi: muallif moliyaviy barqarorlikni bankning foyda olish jarayonida moliyaviy ko‘rsatkichlari va faoliyatining ijobiy holatini ta’minlagan holda bank xizmatlari bozorida o‘z mavqeini mustahkamlash orqali ichki va tashqi muhitning salbiy oqibatlariga qarshi tura olish qobiliyati sifatida ta’riflaydi</w:t>
+      </w:r>
+      <w:r>
+        <w:rPr>
+          <w:rStyle w:val="FootnoteReference"/>
+        </w:rPr>
+        <w:footnoteReference w:id="39"/>
+      </w:r>
+      <w:r>
+        <w:rPr>
+          <w:rFonts w:ascii="Times New Roman" w:hAnsi="Times New Roman" w:cs="Times New Roman" w:eastAsia="Times New Roman"/>
+          <w:sz w:val="28"/>
+        </w:rPr>
+        <w:t xml:space="preserve">. B.A. Madaminov esa barqarorlikni likvidlik va to‘lovga qobiliyatlilik bilan tenglashtiruvchi yondashuvni statik deb tanqid qilib, uni bankning nafaqat muayyan vaqtda majburiyatlarni bajarish, balki endogen va ekzogen shoklarni yutib, faoliyatni to‘xtatmasdan muvozanatni tiklash salohiyatini aks ettiruvchi dinamik xususiyat sifatida belgilaydi</w:t>
+      </w:r>
+      <w:r>
+        <w:rPr>
+          <w:rStyle w:val="FootnoteReference"/>
+        </w:rPr>
+        <w:footnoteReference w:id="40"/>
+      </w:r>
+      <w:r>
+        <w:rPr>
+          <w:rFonts w:ascii="Times New Roman" w:hAnsi="Times New Roman" w:cs="Times New Roman" w:eastAsia="Times New Roman"/>
+          <w:sz w:val="28"/>
+        </w:rPr>
+        <w:t xml:space="preserve">. Sh.Sh. Abdishukurov likvidlik, kapital yetarliligi va rentabellikni «moliyaviy barqarorlik uchburchagi» sifatida qarab, barqarorlikni bitta ko‘rsatkichni optimal darajada ushlab turish emas, balki shu ko‘rsatkichlar o‘rtasidagi muvozanatni ta’minlash qobiliyati deb hisoblaydi</w:t>
+      </w:r>
+      <w:r>
+        <w:rPr>
+          <w:rStyle w:val="FootnoteReference"/>
+        </w:rPr>
+        <w:footnoteReference w:id="41"/>
+      </w:r>
+      <w:r>
+        <w:rPr>
+          <w:rFonts w:ascii="Times New Roman" w:hAnsi="Times New Roman" w:cs="Times New Roman" w:eastAsia="Times New Roman"/>
+          <w:sz w:val="28"/>
+        </w:rPr>
+        <w:t xml:space="preserve">.</w:t>
       </w:r>
     </w:p>
     <w:p>
@@ -1922,13 +2164,56 @@
           <w:rFonts w:ascii="Times New Roman" w:hAnsi="Times New Roman" w:cs="Times New Roman" w:eastAsia="Times New Roman"/>
           <w:sz w:val="28"/>
         </w:rPr>
+        <w:t xml:space="preserve">N.H. Sharipova tijorat banki moliyaviy barqarorligini bankning o‘z funksiyalarini beqaror iqtisodiy sharoitlarda ham uzluksiz va samarali bajarish qobiliyatini ta’minlaydigan, moliyaviy resurslar, kapital va likvidlikni optimal boshqarish orqali barqaror rivojlanishga erishadigan tizimli va dinamik holat sifatida ta’riflaydi</w:t>
+      </w:r>
+      <w:r>
+        <w:rPr>
+          <w:rStyle w:val="FootnoteReference"/>
+        </w:rPr>
+        <w:footnoteReference w:id="42"/>
+      </w:r>
+      <w:r>
+        <w:rPr>
+          <w:rFonts w:ascii="Times New Roman" w:hAnsi="Times New Roman" w:cs="Times New Roman" w:eastAsia="Times New Roman"/>
+          <w:sz w:val="28"/>
+        </w:rPr>
+        <w:t xml:space="preserve">. Bu ta’rifda uzluksizlik va dinamikaga urg‘u berilgani e’tiborga loyiq.</w:t>
+      </w:r>
+    </w:p>
+    <w:p>
+      <w:pPr>
+        <w:pStyle w:val="BodyText"/>
+        <w:spacing w:line="360" w:lineRule="auto" w:before="0" w:after="0"/>
+        <w:ind w:firstLine="709"/>
+        <w:jc w:val="both"/>
+      </w:pPr>
+      <w:r>
+        <w:rPr>
+          <w:rFonts w:ascii="Times New Roman" w:hAnsi="Times New Roman" w:cs="Times New Roman" w:eastAsia="Times New Roman"/>
+          <w:sz w:val="28"/>
+        </w:rPr>
+        <w:t xml:space="preserve">Mahalliy olimlarning ta’riflarini umumlashtirish shuni ko‘rsatadiki, ularda ikki umumiy jihat kuzatiladi. Birinchidan, deyarli barcha mualliflar barqarorlikning dinamik tabiatini ta’kidlaydi va uni muayyan sanadagi holat bilan emas, balki shoklarga bardosh berish va rivojlanishni davom ettirish qobiliyati bilan bog‘laydi. Ikkinchidan, ta’riflarning birortasida ham barqarorlikni qaysi me’yorlar va qaysi hisobot standarti asosida o‘lchash kerakligi, ya’ni uning miqdoriy chegaralari aniq ko‘rsatilmagan. Bu masala amaliy ahamiyatga ega, chunki ikkinchi bobda ko‘rsatilganidek, bir xil bankning aktivlar sifati milliy hisobot va MHXS bo‘yicha bir necha barobar farq qiladigan natija berishi mumkin. Demak, moliyaviy barqarorlik ta’rifi uning xalqaro standartlarda belgilangan chegaralarga nisbatan o‘lchanishini ham nazarda tutishi lozim.</w:t>
+      </w:r>
+    </w:p>
+    <w:p>
+      <w:pPr>
+        <w:pStyle w:val="BodyText"/>
+        <w:spacing w:line="360" w:lineRule="auto" w:before="0" w:after="0"/>
+        <w:ind w:firstLine="709"/>
+        <w:jc w:val="both"/>
+      </w:pPr>
+      <w:r>
+        <w:rPr>
+          <w:rFonts w:ascii="Times New Roman" w:hAnsi="Times New Roman" w:cs="Times New Roman" w:eastAsia="Times New Roman"/>
+          <w:sz w:val="28"/>
+        </w:rPr>
         <w:t xml:space="preserve">Ta’riflardagi xilma-xillikka qaramay, ularning aksariyatida uchta umumiy mezon kuzatiladi. Birinchisi – statik mezon, ya’ni bankning muayyan sanada majburiyatlarini qoplash uchun yetarli kapital va sifatli aktivlarga ega bo‘lishi, boshqacha aytganda, to‘lovga qobiliyatliligi. Ikkinchisi – dinamik mezon, ya’ni kutilmagan shoklar va bozor tebranishlari yuzaga kelganda zararlarni yutib, o‘z holatini tiklay olish qobiliyati. Uchinchisi – funksional mezon, ya’ni stress sharoitida ham iqtisodiyotni kreditlash va to‘lovlarni amalga oshirish funksiyalarini yo‘qotmaslik. A. Krokett ham moliyaviy barqarorlikni asosiy moliya institutlari va bozorlarning barqarorligi sifatida ta’riflab, uning mezoni sifatida institutlarning o‘z shartnoma majburiyatlarini tashqi yordamsiz bajara olishi va bozorlarda narxlarning fundamental omillarni aks ettirishini ko‘rsatadi</w:t>
       </w:r>
       <w:r>
         <w:rPr>
           <w:rStyle w:val="FootnoteReference"/>
         </w:rPr>
-        <w:footnoteReference w:id="37"/>
+        <w:footnoteReference w:id="43"/>
       </w:r>
       <w:r>
         <w:rPr>
@@ -3012,7 +3297,7 @@
         <w:rPr>
           <w:rStyle w:val="FootnoteReference"/>
         </w:rPr>
-        <w:footnoteReference w:id="38"/>
+        <w:footnoteReference w:id="44"/>
       </w:r>
     </w:p>
     <w:p>
@@ -3048,7 +3333,7 @@
         <w:rPr>
           <w:rStyle w:val="FootnoteReference"/>
         </w:rPr>
-        <w:footnoteReference w:id="39"/>
+        <w:footnoteReference w:id="45"/>
       </w:r>
       <w:r>
         <w:rPr>
@@ -3471,7 +3756,7 @@
         <w:rPr>
           <w:rStyle w:val="FootnoteReference"/>
         </w:rPr>
-        <w:footnoteReference w:id="40"/>
+        <w:footnoteReference w:id="46"/>
       </w:r>
     </w:p>
     <w:p>
@@ -3492,7 +3777,7 @@
         <w:rPr>
           <w:rStyle w:val="FootnoteReference"/>
         </w:rPr>
-        <w:footnoteReference w:id="41"/>
+        <w:footnoteReference w:id="47"/>
       </w:r>
       <w:r>
         <w:rPr>
@@ -3520,7 +3805,7 @@
         <w:rPr>
           <w:rStyle w:val="FootnoteReference"/>
         </w:rPr>
-        <w:footnoteReference w:id="42"/>
+        <w:footnoteReference w:id="48"/>
       </w:r>
       <w:r>
         <w:rPr>
@@ -3548,7 +3833,7 @@
         <w:rPr>
           <w:rStyle w:val="FootnoteReference"/>
         </w:rPr>
-        <w:footnoteReference w:id="43"/>
+        <w:footnoteReference w:id="49"/>
       </w:r>
       <w:r>
         <w:rPr>
@@ -4171,7 +4456,7 @@
         <w:rPr>
           <w:rStyle w:val="FootnoteReference"/>
         </w:rPr>
-        <w:footnoteReference w:id="44"/>
+        <w:footnoteReference w:id="50"/>
       </w:r>
     </w:p>
     <w:p>
@@ -4192,7 +4477,7 @@
         <w:rPr>
           <w:rStyle w:val="FootnoteReference"/>
         </w:rPr>
-        <w:footnoteReference w:id="45"/>
+        <w:footnoteReference w:id="51"/>
       </w:r>
       <w:r>
         <w:rPr>
@@ -4248,7 +4533,7 @@
         <w:rPr>
           <w:rStyle w:val="FootnoteReference"/>
         </w:rPr>
-        <w:footnoteReference w:id="46"/>
+        <w:footnoteReference w:id="52"/>
       </w:r>
     </w:p>
     <w:p>
@@ -4269,7 +4554,7 @@
         <w:rPr>
           <w:rStyle w:val="FootnoteReference"/>
         </w:rPr>
-        <w:footnoteReference w:id="47"/>
+        <w:footnoteReference w:id="53"/>
       </w:r>
       <w:r>
         <w:rPr>
@@ -4282,7 +4567,7 @@
         <w:rPr>
           <w:rStyle w:val="FootnoteReference"/>
         </w:rPr>
-        <w:footnoteReference w:id="48"/>
+        <w:footnoteReference w:id="54"/>
       </w:r>
       <w:r>
         <w:rPr>
@@ -4310,7 +4595,7 @@
         <w:rPr>
           <w:rStyle w:val="FootnoteReference"/>
         </w:rPr>
-        <w:footnoteReference w:id="49"/>
+        <w:footnoteReference w:id="55"/>
       </w:r>
       <w:r>
         <w:rPr>
@@ -4323,7 +4608,7 @@
         <w:rPr>
           <w:rStyle w:val="FootnoteReference"/>
         </w:rPr>
-        <w:footnoteReference w:id="50"/>
+        <w:footnoteReference w:id="56"/>
       </w:r>
       <w:r>
         <w:rPr>
@@ -4351,7 +4636,7 @@
         <w:rPr>
           <w:rStyle w:val="FootnoteReference"/>
         </w:rPr>
-        <w:footnoteReference w:id="51"/>
+        <w:footnoteReference w:id="57"/>
       </w:r>
       <w:r>
         <w:rPr>
@@ -4364,7 +4649,7 @@
         <w:rPr>
           <w:rStyle w:val="FootnoteReference"/>
         </w:rPr>
-        <w:footnoteReference w:id="52"/>
+        <w:footnoteReference w:id="58"/>
       </w:r>
       <w:r>
         <w:rPr>
@@ -4392,7 +4677,7 @@
         <w:rPr>
           <w:rStyle w:val="FootnoteReference"/>
         </w:rPr>
-        <w:footnoteReference w:id="53"/>
+        <w:footnoteReference w:id="59"/>
       </w:r>
       <w:r>
         <w:rPr>
@@ -4405,7 +4690,7 @@
         <w:rPr>
           <w:rStyle w:val="FootnoteReference"/>
         </w:rPr>
-        <w:footnoteReference w:id="54"/>
+        <w:footnoteReference w:id="60"/>
       </w:r>
       <w:r>
         <w:rPr>
@@ -4418,7 +4703,7 @@
         <w:rPr>
           <w:rStyle w:val="FootnoteReference"/>
         </w:rPr>
-        <w:footnoteReference w:id="55"/>
+        <w:footnoteReference w:id="61"/>
       </w:r>
       <w:r>
         <w:rPr>
@@ -4446,7 +4731,7 @@
         <w:rPr>
           <w:rStyle w:val="FootnoteReference"/>
         </w:rPr>
-        <w:footnoteReference w:id="56"/>
+        <w:footnoteReference w:id="62"/>
       </w:r>
       <w:r>
         <w:rPr>
@@ -4459,7 +4744,7 @@
         <w:rPr>
           <w:rStyle w:val="FootnoteReference"/>
         </w:rPr>
-        <w:footnoteReference w:id="57"/>
+        <w:footnoteReference w:id="63"/>
       </w:r>
       <w:r>
         <w:rPr>
@@ -4487,7 +4772,7 @@
         <w:rPr>
           <w:rStyle w:val="FootnoteReference"/>
         </w:rPr>
-        <w:footnoteReference w:id="58"/>
+        <w:footnoteReference w:id="64"/>
       </w:r>
       <w:r>
         <w:rPr>
@@ -4500,7 +4785,7 @@
         <w:rPr>
           <w:rStyle w:val="FootnoteReference"/>
         </w:rPr>
-        <w:footnoteReference w:id="59"/>
+        <w:footnoteReference w:id="65"/>
       </w:r>
       <w:r>
         <w:rPr>
@@ -4556,7 +4841,7 @@
         <w:rPr>
           <w:rStyle w:val="FootnoteReference"/>
         </w:rPr>
-        <w:footnoteReference w:id="60"/>
+        <w:footnoteReference w:id="66"/>
       </w:r>
     </w:p>
     <w:p>
@@ -4577,7 +4862,7 @@
         <w:rPr>
           <w:rStyle w:val="FootnoteReference"/>
         </w:rPr>
-        <w:footnoteReference w:id="61"/>
+        <w:footnoteReference w:id="67"/>
       </w:r>
       <w:r>
         <w:rPr>
@@ -4605,7 +4890,7 @@
         <w:rPr>
           <w:rStyle w:val="FootnoteReference"/>
         </w:rPr>
-        <w:footnoteReference w:id="62"/>
+        <w:footnoteReference w:id="68"/>
       </w:r>
       <w:r>
         <w:rPr>
@@ -4618,7 +4903,7 @@
         <w:rPr>
           <w:rStyle w:val="FootnoteReference"/>
         </w:rPr>
-        <w:footnoteReference w:id="63"/>
+        <w:footnoteReference w:id="69"/>
       </w:r>
       <w:r>
         <w:rPr>
@@ -4631,7 +4916,7 @@
         <w:rPr>
           <w:rStyle w:val="FootnoteReference"/>
         </w:rPr>
-        <w:footnoteReference w:id="64"/>
+        <w:footnoteReference w:id="70"/>
       </w:r>
       <w:r>
         <w:rPr>
@@ -4659,7 +4944,7 @@
         <w:rPr>
           <w:rStyle w:val="FootnoteReference"/>
         </w:rPr>
-        <w:footnoteReference w:id="65"/>
+        <w:footnoteReference w:id="71"/>
       </w:r>
       <w:r>
         <w:rPr>
@@ -4707,7 +4992,7 @@
         <w:rPr>
           <w:rStyle w:val="FootnoteReference"/>
         </w:rPr>
-        <w:footnoteReference w:id="66"/>
+        <w:footnoteReference w:id="72"/>
       </w:r>
     </w:p>
     <w:tbl>
@@ -6286,7 +6571,7 @@
         <w:rPr>
           <w:rStyle w:val="FootnoteReference"/>
         </w:rPr>
-        <w:footnoteReference w:id="67"/>
+        <w:footnoteReference w:id="73"/>
       </w:r>
     </w:p>
     <w:p>
@@ -6319,7 +6604,7 @@
         <w:t xml:space="preserve">Tijorat banklari moliyaviy barqarorligining iqtisodiy mazmuni va konseptual modellarini tadqiq etgan holda xulosa qilish mumkinki, moliyaviy barqarorlik stabillik, ishonchlilik va muvozanat kabi yaqin tushunchalardan farqli o‘laroq, bankning rivojlanish jarayoniga xos dinamik va kompleks xususiyatdir. Iqtisodiy adabiyotda bu tushunchaga resurs, institutsional-funksional, ishonch hamda risk va chidamlilik yondashuvlari asosida turlicha ta’rif berilgan bo‘lib, ular bir-birini to‘ldiradi. Moliyaviy barqarorlik alohida bank, bank tizimi va moliya tizimi darajalarida namoyon bo‘ladi va bu darajalar o‘zaro ta’sirda bo‘ladi, unga esa tashqi va ichki omillar, jumladan, ishonch va aktivlar sifati hal qiluvchi ta’sir ko‘rsatadi. Likvidlik yaratish, moliyaviy beqarorlik, kapital-bufer, Z-score, makroprudensial va kelajakka yo‘naltirilgan risk modellari moliyaviy barqarorlikning turli tomonlarini tushuntiradi, nazorat amaliyoti esa mikroprudensial konsepsiyadan makroprudensial va kelajakka yo‘naltirilgan konsepsiyalar sinteziga o‘tmoqda, ammo ularning birortasi alohida olinganda tijorat banki barqarorligini to‘liq tavsiflay olmaydi. Bu o‘z navbatida, kapital, aktivlar sifati, likvidlik, daromadlilik va boshqaruv sifati bloklarini ularning darajasi, dinamikasi va muvozanati bilan birga hisobga oladigan integral baholash metodikasini ishlab chiqish zaruriyatini yuzaga keltiradi. Bunday metodikaning xalqaro standartlar bilan bog‘liqligi keyingi paragrafda tahlil qilinadi.</w:t>
       </w:r>
     </w:p>
-    <w:bookmarkEnd w:id="68"/>
+    <w:bookmarkEnd w:id="74"/>
     <w:sectPr>
       <w:pgMar w:left="1701" w:right="850" w:top="1134" w:bottom="1134"/>
     </w:sectPr>
@@ -6457,7 +6742,7 @@
         <w:t xml:space="preserve"> </w:t>
       </w:r>
       <w:r>
-        <w:t xml:space="preserve">Tadqiqot natijasida muallif tomonidan quyidagi manbalar asosida ishlab chiqildi: Оценка финансовой устойчивости кредитной организации: учебник / под ред. О.И. Лаврушина, И.Д. Мамоновой. – М.: КНОРУС, 2011. – С. 24; Устойчивость банковской системы и развитие банковской политики: монография / под ред. О.И. Лаврушина. – М.: КНОРУС, 2014. – С. 38; Schinasi G.J. Defining Financial Stability: IMF Working Paper WP/04/187. – Washington, DC: International Monetary Fund, 2004. – 18 p; Mishkin F.S. Global Financial Instability: Framework, Events, Issues // Journal of Economic Perspectives. – 1999. – Vol. 13, No. 4. – P. 3–20; Hendrickson J.M. Regulation and Instability in U.S. Commercial Banking: A History of Crises. – Basingstoke: Palgrave Macmillan, 2011. – P. 6–7; Thakor A.V. Leverage, System Risk and Financial System Health: How Do We Develop a Healthy Financial System? // Governance, Regulation and Bank Stability / ed. by T. Lindblom, S. Sjögren, M. Willesson. – Basingstoke: Palgrave Macmillan, 2014. – P. 13–16; Sattarov O.B. O‘zbekiston Respublikasi bank tizimi barqarorligini ta’minlash metodologiyasini takomillashtirish: iqtisodiyot fanlari doktori (DSc) dissertatsiyasi avtoreferati. – Toshkent, 2018. – B. 13; Sadikov I.G. Iqtisodiyotni transformatsiyalash jarayonida tijorat banklarining moliyaviy barqarorligini ta’minlash yo‘llari: iqtisodiyot fanlari bo‘yicha falsafa doktori (PhD) dissertatsiyasi avtoreferati. – Toshkent, 2025. – B. 11; Madaminov B.A. Tijorat banklarida risk-menejment tizimini takomillashtirish asosida moliyaviy barqarorlikni ta’minlash metodologiyasi: iqtisodiyot fanlari doktori (DSc) dissertatsiyasi avtoreferati. – Toshkent, 2026. – B. 12; Sharipova N.H. Tijorat banklari moliyaviy barqarorligini mustahkamlashning konseptual asoslarini takomillashtirish: iqtisodiyot fanlari doktori (DSc) dissertatsiyasi avtoreferati. – Toshkent, 2026. – B. 13–14.</w:t>
+        <w:t xml:space="preserve">Tadqiqot natijasida muallif tomonidan quyidagi manbalar asosida ishlab chiqildi: Оценка финансовой устойчивости кредитной организации: учебник / под ред. О.И. Лаврушина, И.Д. Мамоновой. – М.: КНОРУС, 2011. – С. 24; Устойчивость банковской системы и развитие банковской политики: монография / под ред. О.И. Лаврушина. – М.: КНОРУС, 2014. – С. 38; Schinasi G.J. Defining Financial Stability: IMF Working Paper WP/04/187. – Washington, DC: International Monetary Fund, 2004. – 18 p; Mishkin F.S. Global Financial Instability: Framework, Events, Issues // Journal of Economic Perspectives. – 1999. – Vol. 13, No. 4. – P. 3–20; Hendrickson J.M. Regulation and Instability in U.S. Commercial Banking: A History of Crises. – Basingstoke: Palgrave Macmillan, 2011. – P. 6–7; Thakor A.V. Leverage, System Risk and Financial System Health: How Do We Develop a Healthy Financial System? // Governance, Regulation and Bank Stability / ed. by T. Lindblom, S. Sjögren, M. Willesson. – Basingstoke: Palgrave Macmillan, 2014. – P. 13–16; Фетисов Г.Г. Устойчивость коммерческого банка и рейтинговые системы ее оценки. – М.: Финансы и статистика, 1999; Герасимова Е.Б. Феноменологический подход к анализу устойчивости организации // Сибирская финансовая школа. – 2011. – № 3. – Цит. по: Вотинцева Р.С. Современные теоретические подходы к определению понятия «Финансовая устойчивость коммерческих банков» // Вестник Удмуртского университета. Серия «Экономика и право». – 2014. – Вып. 3. – С. 46; Шуббар Х.Х., Гиринский А.В. Содержание и принципы устойчивости банковской системы // Вестник РУДН. Серия: Экономика. – 2019. – Т. 27, № 1. – С. 65; Houben A., Kakes J., Schinasi G. Toward a Framework for Safeguarding Financial Stability: IMF Working Paper WP/04/101. – Washington, DC: International Monetary Fund, 2004. – P. 11; Sattarov O.B. O‘zbekiston Respublikasi bank tizimi barqarorligini ta’minlash metodologiyasini takomillashtirish: iqtisodiyot fanlari doktori (DSc) dissertatsiyasi avtoreferati. – Toshkent, 2018. – B. 13; Sadikov I.G. Iqtisodiyotni transformatsiyalash jarayonida tijorat banklarining moliyaviy barqarorligini ta’minlash yo‘llari: iqtisodiyot fanlari bo‘yicha falsafa doktori (PhD) dissertatsiyasi avtoreferati. – Toshkent, 2025. – B. 11; Madaminov B.A. Tijorat banklarida risk-menejment tizimini takomillashtirish asosida moliyaviy barqarorlikni ta’minlash metodologiyasi: iqtisodiyot fanlari doktori (DSc) dissertatsiyasi avtoreferati. – Toshkent, 2026. – B. 12; Sharipova N.H. Tijorat banklari moliyaviy barqarorligini mustahkamlashning konseptual asoslarini takomillashtirish: iqtisodiyot fanlari doktori (DSc) dissertatsiyasi avtoreferati. – Toshkent, 2026. – B. 13–14.</w:t>
       </w:r>
     </w:p>
   </w:footnote>
@@ -6514,7 +6799,7 @@
         <w:t xml:space="preserve"> </w:t>
       </w:r>
       <w:r>
-        <w:t xml:space="preserve">Schinasi G.J. Defining Financial Stability: IMF Working Paper WP/04/187. – Washington, DC: International Monetary Fund, 2004. – 18 p.</w:t>
+        <w:t xml:space="preserve">Фетисов Г.Г. Устойчивость коммерческого банка и рейтинговые системы ее оценки. – М.: Финансы и статистика, 1999; Герасимова Е.Б. Феноменологический подход к анализу устойчивости организации // Сибирская финансовая школа. – 2011. – № 3. – Цит. по: Вотинцева Р.С. Современные теоретические подходы к определению понятия «Финансовая устойчивость коммерческих банков» // Вестник Удмуртского университета. Серия «Экономика и право». – 2014. – Вып. 3. – С. 46.</w:t>
       </w:r>
     </w:p>
   </w:footnote>
@@ -6533,7 +6818,7 @@
         <w:t xml:space="preserve"> </w:t>
       </w:r>
       <w:r>
-        <w:t xml:space="preserve">Mishkin F.S. Global Financial Instability: Framework, Events, Issues // Journal of Economic Perspectives. – 1999. – Vol. 13, No. 4. – P. 3–20.</w:t>
+        <w:t xml:space="preserve">Шуббар Х.Х., Гиринский А.В. Содержание и принципы устойчивости банковской системы // Вестник РУДН. Серия: Экономика. – 2019. – Т. 27, № 1. – С. 65.</w:t>
       </w:r>
     </w:p>
   </w:footnote>
@@ -6552,7 +6837,7 @@
         <w:t xml:space="preserve"> </w:t>
       </w:r>
       <w:r>
-        <w:t xml:space="preserve">Hendrickson J.M. Regulation and Instability in U.S. Commercial Banking: A History of Crises. – Basingstoke: Palgrave Macmillan, 2011. – P. 6–7.</w:t>
+        <w:t xml:space="preserve">Тимофеева З.А. Концептуальные основы исследования экономического содержания финансовой устойчивости банковской системы // Финансы и кредит. – 2014. – № 6 (582). – С. 17.</w:t>
       </w:r>
     </w:p>
   </w:footnote>
@@ -6571,7 +6856,7 @@
         <w:t xml:space="preserve"> </w:t>
       </w:r>
       <w:r>
-        <w:t xml:space="preserve">Sattarov O.B. O‘zbekiston Respublikasi bank tizimi barqarorligini ta’minlash metodologiyasini takomillashtirish: iqtisodiyot fanlari doktori (DSc) dissertatsiyasi avtoreferati. – Toshkent, 2018. – B. 13.</w:t>
+        <w:t xml:space="preserve">Schinasi G.J. Defining Financial Stability: IMF Working Paper WP/04/187. – Washington, DC: International Monetary Fund, 2004. – 18 p.</w:t>
       </w:r>
     </w:p>
   </w:footnote>
@@ -6590,7 +6875,7 @@
         <w:t xml:space="preserve"> </w:t>
       </w:r>
       <w:r>
-        <w:t xml:space="preserve">Bozorov R.X. Tijorat banklari moliyaviy barqarorligini ta’minlashni takomillashtirish: iqtisodiyot fanlari bo‘yicha falsafa doktori (PhD) dissertatsiyasi avtoreferati. – Toshkent, 2020. – B. 11.</w:t>
+        <w:t xml:space="preserve">Mishkin F.S. Global Financial Instability: Framework, Events, Issues // Journal of Economic Perspectives. – 1999. – Vol. 13, No. 4. – P. 3–20.</w:t>
       </w:r>
     </w:p>
   </w:footnote>
@@ -6609,7 +6894,7 @@
         <w:t xml:space="preserve"> </w:t>
       </w:r>
       <w:r>
-        <w:t xml:space="preserve">Sadikov I.G. Iqtisodiyotni transformatsiyalash jarayonida tijorat banklarining moliyaviy barqarorligini ta’minlash yo‘llari: iqtisodiyot fanlari bo‘yicha falsafa doktori (PhD) dissertatsiyasi avtoreferati. – Toshkent, 2025. – B. 11.</w:t>
+        <w:t xml:space="preserve">Hendrickson J.M. Regulation and Instability in U.S. Commercial Banking: A History of Crises. – Basingstoke: Palgrave Macmillan, 2011. – P. 6–7.</w:t>
       </w:r>
     </w:p>
   </w:footnote>
@@ -6628,7 +6913,7 @@
         <w:t xml:space="preserve"> </w:t>
       </w:r>
       <w:r>
-        <w:t xml:space="preserve">Madaminov B.A. Tijorat banklarida risk-menejment tizimini takomillashtirish asosida moliyaviy barqarorlikni ta’minlash metodologiyasi: iqtisodiyot fanlari doktori (DSc) dissertatsiyasi avtoreferati. – Toshkent, 2026. – B. 12.</w:t>
+        <w:t xml:space="preserve">Houben A., Kakes J., Schinasi G. Toward a Framework for Safeguarding Financial Stability: IMF Working Paper WP/04/101. – Washington, DC: International Monetary Fund, 2004. – P. 11.</w:t>
       </w:r>
     </w:p>
   </w:footnote>
@@ -6647,7 +6932,7 @@
         <w:t xml:space="preserve"> </w:t>
       </w:r>
       <w:r>
-        <w:t xml:space="preserve">Abdishukurov Sh.Sh. Tijorat banklarining moliyaviy barqarorligini ta’minlash yo‘nalishlari: iqtisodiyot fanlari bo‘yicha falsafa doktori (PhD) dissertatsiyasi avtoreferati. – Toshkent, 2026. – B. 15.</w:t>
+        <w:t xml:space="preserve">European Central Bank. Financial stability and macroprudential policy. – https://www.ecb.europa.eu/paym/financial-stability/html/index.en.html</w:t>
       </w:r>
     </w:p>
   </w:footnote>
@@ -6666,7 +6951,7 @@
         <w:t xml:space="preserve"> </w:t>
       </w:r>
       <w:r>
-        <w:t xml:space="preserve">Sharipova N.H. Tijorat banklari moliyaviy barqarorligini mustahkamlashning konseptual asoslarini takomillashtirish: iqtisodiyot fanlari doktori (DSc) dissertatsiyasi avtoreferati. – Toshkent, 2026. – B. 13–14.</w:t>
+        <w:t xml:space="preserve">Čihák M. How Do Central Banks Write on Financial Stability?: IMF Working Paper WP/06/163. – Washington, DC: International Monetary Fund, 2006. – P. 19.</w:t>
       </w:r>
     </w:p>
   </w:footnote>
@@ -6685,7 +6970,7 @@
         <w:t xml:space="preserve"> </w:t>
       </w:r>
       <w:r>
-        <w:t xml:space="preserve">Crockett A. Why Is Financial Stability a Goal of Public Policy? // Maintaining Financial Stability in a Global Economy. – Kansas City: Federal Reserve Bank of Kansas City, 1997. – P. 7–36.</w:t>
+        <w:t xml:space="preserve">Sattarov O.B. O‘zbekiston Respublikasi bank tizimi barqarorligini ta’minlash metodologiyasini takomillashtirish: iqtisodiyot fanlari doktori (DSc) dissertatsiyasi avtoreferati. – Toshkent, 2018. – B. 13.</w:t>
       </w:r>
     </w:p>
   </w:footnote>
@@ -6704,7 +6989,7 @@
         <w:t xml:space="preserve"> </w:t>
       </w:r>
       <w:r>
-        <w:t xml:space="preserve">Tadqiqot natijasida muallif tomonidan ishlab chiqildi.</w:t>
+        <w:t xml:space="preserve">Bozorov R.X. Tijorat banklari moliyaviy barqarorligini ta’minlashni takomillashtirish: iqtisodiyot fanlari bo‘yicha falsafa doktori (PhD) dissertatsiyasi avtoreferati. – Toshkent, 2020. – B. 11.</w:t>
       </w:r>
     </w:p>
   </w:footnote>
@@ -6723,7 +7008,7 @@
         <w:t xml:space="preserve"> </w:t>
       </w:r>
       <w:r>
-        <w:t xml:space="preserve">Оценка финансовой устойчивости кредитной организации: учебник / под ред. О.И. Лаврушина, И.Д. Мамоновой. – М.: КНОРУС, 2011. – С. 41–45.</w:t>
+        <w:t xml:space="preserve">Sadikov I.G. Iqtisodiyotni transformatsiyalash jarayonida tijorat banklarining moliyaviy barqarorligini ta’minlash yo‘llari: iqtisodiyot fanlari bo‘yicha falsafa doktori (PhD) dissertatsiyasi avtoreferati. – Toshkent, 2025. – B. 11.</w:t>
       </w:r>
     </w:p>
   </w:footnote>
@@ -6742,7 +7027,7 @@
         <w:t xml:space="preserve"> </w:t>
       </w:r>
       <w:r>
-        <w:t xml:space="preserve">Tadqiqot natijasida muallif tomonidan quyidagi manbalar asosida ishlab chiqildi: Оценка финансовой устойчивости кредитной организации: учебник / под ред. О.И. Лаврушина, И.Д. Мамоновой. – М.: КНОРУС, 2011. – С. 41–45; Регулирование банковской сферы: учебник / под ред. О.Н. Афанасьевой, С.Е. Дубовой. – М.: КНОРУС. – С. 49–55.</w:t>
+        <w:t xml:space="preserve">Madaminov B.A. Tijorat banklarida risk-menejment tizimini takomillashtirish asosida moliyaviy barqarorlikni ta’minlash metodologiyasi: iqtisodiyot fanlari doktori (DSc) dissertatsiyasi avtoreferati. – Toshkent, 2026. – B. 12.</w:t>
       </w:r>
     </w:p>
   </w:footnote>
@@ -6761,7 +7046,7 @@
         <w:t xml:space="preserve"> </w:t>
       </w:r>
       <w:r>
-        <w:t xml:space="preserve">Регулирование банковской сферы: учебник / под ред. О.Н. Афанасьевой, С.Е. Дубовой. – М.: КНОРУС. – С. 49.</w:t>
+        <w:t xml:space="preserve">Abdishukurov Sh.Sh. Tijorat banklarining moliyaviy barqarorligini ta’minlash yo‘nalishlari: iqtisodiyot fanlari bo‘yicha falsafa doktori (PhD) dissertatsiyasi avtoreferati. – Toshkent, 2026. – B. 15.</w:t>
       </w:r>
     </w:p>
   </w:footnote>
@@ -6780,7 +7065,7 @@
         <w:t xml:space="preserve"> </w:t>
       </w:r>
       <w:r>
-        <w:t xml:space="preserve">Оценка финансовой устойчивости кредитной организации: учебник / под ред. О.И. Лаврушина, И.Д. Мамоновой. – М.: КНОРУС, 2011. – С. 28–31.</w:t>
+        <w:t xml:space="preserve">Sharipova N.H. Tijorat banklari moliyaviy barqarorligini mustahkamlashning konseptual asoslarini takomillashtirish: iqtisodiyot fanlari doktori (DSc) dissertatsiyasi avtoreferati. – Toshkent, 2026. – B. 13–14.</w:t>
       </w:r>
     </w:p>
   </w:footnote>
@@ -6799,7 +7084,7 @@
         <w:t xml:space="preserve"> </w:t>
       </w:r>
       <w:r>
-        <w:t xml:space="preserve">Оценка финансовой устойчивости кредитной организации: учебник / под ред. О.И. Лаврушина, И.Д. Мамоновой. – М.: КНОРУС, 2011. – С. 31–41.</w:t>
+        <w:t xml:space="preserve">Crockett A. Why Is Financial Stability a Goal of Public Policy? // Maintaining Financial Stability in a Global Economy. – Kansas City: Federal Reserve Bank of Kansas City, 1997. – P. 7–36.</w:t>
       </w:r>
     </w:p>
   </w:footnote>
@@ -6818,7 +7103,7 @@
         <w:t xml:space="preserve"> </w:t>
       </w:r>
       <w:r>
-        <w:t xml:space="preserve">Tadqiqot natijasida muallif tomonidan quyidagi manbalar asosida ishlab chiqildi: Оценка финансовой устойчивости кредитной организации: учебник / под ред. О.И. Лаврушина, И.Д. Мамоновой. – М.: КНОРУС, 2011. – С. 31–41.</w:t>
+        <w:t xml:space="preserve">Tadqiqot natijasida muallif tomonidan ishlab chiqildi.</w:t>
       </w:r>
     </w:p>
   </w:footnote>
@@ -6837,7 +7122,7 @@
         <w:t xml:space="preserve"> </w:t>
       </w:r>
       <w:r>
-        <w:t xml:space="preserve">Оценка финансовой устойчивости кредитной организации: учебник / под ред. О.И. Лаврушина, И.Д. Мамоновой. – М.: КНОРУС, 2011. – С. 35–36.</w:t>
+        <w:t xml:space="preserve">Оценка финансовой устойчивости кредитной организации: учебник / под ред. О.И. Лаврушина, И.Д. Мамоновой. – М.: КНОРУС, 2011. – С. 41–45.</w:t>
       </w:r>
     </w:p>
   </w:footnote>
@@ -6856,7 +7141,7 @@
         <w:t xml:space="preserve"> </w:t>
       </w:r>
       <w:r>
-        <w:t xml:space="preserve">Tadqiqot natijasida muallif tomonidan quyidagi manba ma’lumotlari asosida ishlab chiqildi: Оценка финансовой устойчивости кредитной организации: учебник / под ред. О.И. Лаврушина, И.Д. Мамоновой. – М.: КНОРУС, 2011. – С. 44.</w:t>
+        <w:t xml:space="preserve">Tadqiqot natijasida muallif tomonidan quyidagi manbalar asosida ishlab chiqildi: Оценка финансовой устойчивости кредитной организации: учебник / под ред. О.И. Лаврушина, И.Д. Мамоновой. – М.: КНОРУС, 2011. – С. 41–45; Регулирование банковской сферы: учебник / под ред. О.Н. Афанасьевой, С.Е. Дубовой. – М.: КНОРУС. – С. 49–55.</w:t>
       </w:r>
     </w:p>
   </w:footnote>
@@ -6875,7 +7160,7 @@
         <w:t xml:space="preserve"> </w:t>
       </w:r>
       <w:r>
-        <w:t xml:space="preserve">Оценка финансовой устойчивости кредитной организации: учебник / под ред. О.И. Лаврушина, И.Д. Мамоновой. – М.: КНОРУС, 2011. – С. 44.</w:t>
+        <w:t xml:space="preserve">Регулирование банковской сферы: учебник / под ред. О.Н. Афанасьевой, С.Е. Дубовой. – М.: КНОРУС. – С. 49.</w:t>
       </w:r>
     </w:p>
   </w:footnote>
@@ -6894,7 +7179,7 @@
         <w:t xml:space="preserve"> </w:t>
       </w:r>
       <w:r>
-        <w:t xml:space="preserve">Оценка финансовой устойчивости кредитной организации: учебник / под ред. О.И. Лаврушина, И.Д. Мамоновой. – М.: КНОРУС, 2011. – С. 45.</w:t>
+        <w:t xml:space="preserve">Оценка финансовой устойчивости кредитной организации: учебник / под ред. О.И. Лаврушина, И.Д. Мамоновой. – М.: КНОРУС, 2011. – С. 28–31.</w:t>
       </w:r>
     </w:p>
   </w:footnote>
@@ -6913,7 +7198,7 @@
         <w:t xml:space="preserve"> </w:t>
       </w:r>
       <w:r>
-        <w:t xml:space="preserve">Peláez C.M., Peláez C.A. Regulation of Banks and Finance: Theory and Policy after the Credit Crisis. – Basingstoke: Palgrave Macmillan, 2009. – P. 17.</w:t>
+        <w:t xml:space="preserve">Оценка финансовой устойчивости кредитной организации: учебник / под ред. О.И. Лаврушина, И.Д. Мамоновой. – М.: КНОРУС, 2011. – С. 31–41.</w:t>
       </w:r>
     </w:p>
   </w:footnote>
@@ -6932,7 +7217,7 @@
         <w:t xml:space="preserve"> </w:t>
       </w:r>
       <w:r>
-        <w:t xml:space="preserve">Tarullo D.K. Banking on Basel: The Future of International Financial Regulation. – Washington, DC: Peterson Institute for International Economics, 2008. – P. 19–23.</w:t>
+        <w:t xml:space="preserve">Tadqiqot natijasida muallif tomonidan quyidagi manbalar asosida ishlab chiqildi: Оценка финансовой устойчивости кредитной организации: учебник / под ред. О.И. Лаврушина, И.Д. Мамоновой. – М.: КНОРУС, 2011. – С. 31–41.</w:t>
       </w:r>
     </w:p>
   </w:footnote>
@@ -6951,7 +7236,7 @@
         <w:t xml:space="preserve"> </w:t>
       </w:r>
       <w:r>
-        <w:t xml:space="preserve">Diamond D.W., Dybvig P.H. Bank Runs, Deposit Insurance, and Liquidity // Journal of Political Economy. – 1983. – Vol. 91, No. 3. – P. 401–419.</w:t>
+        <w:t xml:space="preserve">Оценка финансовой устойчивости кредитной организации: учебник / под ред. О.И. Лаврушина, И.Д. Мамоновой. – М.: КНОРУС, 2011. – С. 35–36.</w:t>
       </w:r>
     </w:p>
   </w:footnote>
@@ -6970,7 +7255,7 @@
         <w:t xml:space="preserve"> </w:t>
       </w:r>
       <w:r>
-        <w:t xml:space="preserve">Peláez C.M., Peláez C.A. Regulation of Banks and Finance: Theory and Policy after the Credit Crisis. – Basingstoke: Palgrave Macmillan, 2009. – P. 61–66.</w:t>
+        <w:t xml:space="preserve">Tadqiqot natijasida muallif tomonidan quyidagi manba ma’lumotlari asosida ishlab chiqildi: Оценка финансовой устойчивости кредитной организации: учебник / под ред. О.И. Лаврушина, И.Д. Мамоновой. – М.: КНОРУС, 2011. – С. 44.</w:t>
       </w:r>
     </w:p>
   </w:footnote>
@@ -6989,7 +7274,7 @@
         <w:t xml:space="preserve"> </w:t>
       </w:r>
       <w:r>
-        <w:t xml:space="preserve">Minsky H.P. The Financial Instability Hypothesis: Working Paper No. 74. – Annandale-on-Hudson: The Jerome Levy Economics Institute of Bard College, 1992. – 10 p.</w:t>
+        <w:t xml:space="preserve">Оценка финансовой устойчивости кредитной организации: учебник / под ред. О.И. Лаврушина, И.Д. Мамоновой. – М.: КНОРУС, 2011. – С. 44.</w:t>
       </w:r>
     </w:p>
   </w:footnote>
@@ -7008,7 +7293,7 @@
         <w:t xml:space="preserve"> </w:t>
       </w:r>
       <w:r>
-        <w:t xml:space="preserve">Hendrickson J.M. Regulation and Instability in U.S. Commercial Banking: A History of Crises. – Basingstoke: Palgrave Macmillan, 2011. – P. 5–6.</w:t>
+        <w:t xml:space="preserve">Оценка финансовой устойчивости кредитной организации: учебник / под ред. О.И. Лаврушина, И.Д. Мамоновой. – М.: КНОРУС, 2011. – С. 45.</w:t>
       </w:r>
     </w:p>
   </w:footnote>
@@ -7027,7 +7312,7 @@
         <w:t xml:space="preserve"> </w:t>
       </w:r>
       <w:r>
-        <w:t xml:space="preserve">Thakor A.V. Leverage, System Risk and Financial System Health: How Do We Develop a Healthy Financial System? // Governance, Regulation and Bank Stability / ed. by T. Lindblom, S. Sjögren, M. Willesson. – Basingstoke: Palgrave Macmillan, 2014. – P. 10–12.</w:t>
+        <w:t xml:space="preserve">Peláez C.M., Peláez C.A. Regulation of Banks and Finance: Theory and Policy after the Credit Crisis. – Basingstoke: Palgrave Macmillan, 2009. – P. 17.</w:t>
       </w:r>
     </w:p>
   </w:footnote>
@@ -7046,7 +7331,7 @@
         <w:t xml:space="preserve"> </w:t>
       </w:r>
       <w:r>
-        <w:t xml:space="preserve">Tarullo D.K. Banking on Basel: The Future of International Financial Regulation. – Washington, DC: Peterson Institute for International Economics, 2008. – P. 16.</w:t>
+        <w:t xml:space="preserve">Tarullo D.K. Banking on Basel: The Future of International Financial Regulation. – Washington, DC: Peterson Institute for International Economics, 2008. – P. 19–23.</w:t>
       </w:r>
     </w:p>
   </w:footnote>
@@ -7065,7 +7350,7 @@
         <w:t xml:space="preserve"> </w:t>
       </w:r>
       <w:r>
-        <w:t xml:space="preserve">Merton R.C. On the Pricing of Corporate Debt: The Risk Structure of Interest Rates // Journal of Finance. – 1974. – Vol. 29, No. 2. – P. 449–470.</w:t>
+        <w:t xml:space="preserve">Diamond D.W., Dybvig P.H. Bank Runs, Deposit Insurance, and Liquidity // Journal of Political Economy. – 1983. – Vol. 91, No. 3. – P. 401–419.</w:t>
       </w:r>
     </w:p>
   </w:footnote>
@@ -7084,7 +7369,7 @@
         <w:t xml:space="preserve"> </w:t>
       </w:r>
       <w:r>
-        <w:t xml:space="preserve">Roy A.D. Safety First and the Holding of Assets // Econometrica. – 1952. – Vol. 20, No. 3. – P. 431–449.</w:t>
+        <w:t xml:space="preserve">Peláez C.M., Peláez C.A. Regulation of Banks and Finance: Theory and Policy after the Credit Crisis. – Basingstoke: Palgrave Macmillan, 2009. – P. 61–66.</w:t>
       </w:r>
     </w:p>
   </w:footnote>
@@ -7103,7 +7388,7 @@
         <w:t xml:space="preserve"> </w:t>
       </w:r>
       <w:r>
-        <w:t xml:space="preserve">Boyd J.H., Graham S.L. Risk, Regulation, and Bank Holding Company Expansion into Nonbanking // Federal Reserve Bank of Minneapolis Quarterly Review. – 1986. – Vol. 10, No. 2. – P. 2–17.</w:t>
+        <w:t xml:space="preserve">Minsky H.P. The Financial Instability Hypothesis: Working Paper No. 74. – Annandale-on-Hudson: The Jerome Levy Economics Institute of Bard College, 1992. – 10 p.</w:t>
       </w:r>
     </w:p>
   </w:footnote>
@@ -7122,7 +7407,7 @@
         <w:t xml:space="preserve"> </w:t>
       </w:r>
       <w:r>
-        <w:t xml:space="preserve">Tadqiqot natijasida muallif tomonidan quyidagi manba ma’lumotlari asosida ishlab chiqildi: Chiaramonte L., Poli F. Predicting European Bank Distress: Evidence from the Recent Financial Crisis // Governance, Regulation and Bank Stability / ed. by T. Lindblom, S. Sjögren, M. Willesson. – Basingstoke: Palgrave Macmillan, 2014. – P. 92–95.</w:t>
+        <w:t xml:space="preserve">Hendrickson J.M. Regulation and Instability in U.S. Commercial Banking: A History of Crises. – Basingstoke: Palgrave Macmillan, 2011. – P. 5–6.</w:t>
       </w:r>
     </w:p>
   </w:footnote>
@@ -7141,7 +7426,7 @@
         <w:t xml:space="preserve"> </w:t>
       </w:r>
       <w:r>
-        <w:t xml:space="preserve">Chiaramonte L., Poli F. Predicting European Bank Distress: Evidence from the Recent Financial Crisis // Governance, Regulation and Bank Stability / ed. by T. Lindblom, S. Sjögren, M. Willesson. – Basingstoke: Palgrave Macmillan, 2014. – P. 83–95.</w:t>
+        <w:t xml:space="preserve">Thakor A.V. Leverage, System Risk and Financial System Health: How Do We Develop a Healthy Financial System? // Governance, Regulation and Bank Stability / ed. by T. Lindblom, S. Sjögren, M. Willesson. – Basingstoke: Palgrave Macmillan, 2014. – P. 10–12.</w:t>
       </w:r>
     </w:p>
   </w:footnote>
@@ -7160,7 +7445,7 @@
         <w:t xml:space="preserve"> </w:t>
       </w:r>
       <w:r>
-        <w:t xml:space="preserve">Borio C. Towards a Macroprudential Framework for Financial Supervision and Regulation?: BIS Working Papers No. 128. – Basel: Bank for International Settlements, 2003. – 32 p.</w:t>
+        <w:t xml:space="preserve">Tarullo D.K. Banking on Basel: The Future of International Financial Regulation. – Washington, DC: Peterson Institute for International Economics, 2008. – P. 16.</w:t>
       </w:r>
     </w:p>
   </w:footnote>
@@ -7179,7 +7464,7 @@
         <w:t xml:space="preserve"> </w:t>
       </w:r>
       <w:r>
-        <w:t xml:space="preserve">Adrian T., Brunnermeier M.K. CoVaR // American Economic Review. – 2016. – Vol. 106, No. 7. – P. 1705–1741.</w:t>
+        <w:t xml:space="preserve">Merton R.C. On the Pricing of Corporate Debt: The Risk Structure of Interest Rates // Journal of Finance. – 1974. – Vol. 29, No. 2. – P. 449–470.</w:t>
       </w:r>
     </w:p>
   </w:footnote>
@@ -7198,7 +7483,7 @@
         <w:t xml:space="preserve"> </w:t>
       </w:r>
       <w:r>
-        <w:t xml:space="preserve">Регулирование банковской сферы: учебник / под ред. О.Н. Афанасьевой, С.Е. Дубовой. – М.: КНОРУС. – С. 55–62.</w:t>
+        <w:t xml:space="preserve">Roy A.D. Safety First and the Holding of Assets // Econometrica. – 1952. – Vol. 20, No. 3. – P. 431–449.</w:t>
       </w:r>
     </w:p>
   </w:footnote>
@@ -7217,7 +7502,7 @@
         <w:t xml:space="preserve"> </w:t>
       </w:r>
       <w:r>
-        <w:t xml:space="preserve">IFRS 9 Financial Instruments. – London: International Accounting Standards Board, 2014.</w:t>
+        <w:t xml:space="preserve">Boyd J.H., Graham S.L. Risk, Regulation, and Bank Holding Company Expansion into Nonbanking // Federal Reserve Bank of Minneapolis Quarterly Review. – 1986. – Vol. 10, No. 2. – P. 2–17.</w:t>
       </w:r>
     </w:p>
   </w:footnote>
@@ -7236,11 +7521,125 @@
         <w:t xml:space="preserve"> </w:t>
       </w:r>
       <w:r>
-        <w:t xml:space="preserve">Tadqiqot natijasida muallif tomonidan quyidagi manbalar asosida ishlab chiqildi: Diamond D.W., Dybvig P.H. Bank Runs, Deposit Insurance, and Liquidity // Journal of Political Economy. – 1983. – Vol. 91, No. 3. – P. 401–419; Minsky H.P. The Financial Instability Hypothesis: Working Paper No. 74. – Annandale-on-Hudson: The Jerome Levy Economics Institute of Bard College, 1992. – 10 p; Tarullo D.K. Banking on Basel: The Future of International Financial Regulation. – Washington, DC: Peterson Institute for International Economics, 2008. – P. 16; Merton R.C. On the Pricing of Corporate Debt: The Risk Structure of Interest Rates // Journal of Finance. – 1974. – Vol. 29, No. 2. – P. 449–470; Boyd J.H., Graham S.L. Risk, Regulation, and Bank Holding Company Expansion into Nonbanking // Federal Reserve Bank of Minneapolis Quarterly Review. – 1986. – Vol. 10, No. 2. – P. 2–17; Borio C. Towards a Macroprudential Framework for Financial Supervision and Regulation?: BIS Working Papers No. 128. – Basel: Bank for International Settlements, 2003. – 32 p; Adrian T., Brunnermeier M.K. CoVaR // American Economic Review. – 2016. – Vol. 106, No. 7. – P. 1705–1741; IFRS 9 Financial Instruments. – London: International Accounting Standards Board, 2014.</w:t>
+        <w:t xml:space="preserve">Tadqiqot natijasida muallif tomonidan quyidagi manba ma’lumotlari asosida ishlab chiqildi: Chiaramonte L., Poli F. Predicting European Bank Distress: Evidence from the Recent Financial Crisis // Governance, Regulation and Bank Stability / ed. by T. Lindblom, S. Sjögren, M. Willesson. – Basingstoke: Palgrave Macmillan, 2014. – P. 92–95.</w:t>
       </w:r>
     </w:p>
   </w:footnote>
   <w:footnote w:id="67">
+    <w:p>
+      <w:pPr>
+        <w:pStyle w:val="FootnoteText"/>
+      </w:pPr>
+      <w:r>
+        <w:rPr>
+          <w:rStyle w:val="FootnoteReference"/>
+        </w:rPr>
+        <w:footnoteRef/>
+      </w:r>
+      <w:r>
+        <w:t xml:space="preserve"> </w:t>
+      </w:r>
+      <w:r>
+        <w:t xml:space="preserve">Chiaramonte L., Poli F. Predicting European Bank Distress: Evidence from the Recent Financial Crisis // Governance, Regulation and Bank Stability / ed. by T. Lindblom, S. Sjögren, M. Willesson. – Basingstoke: Palgrave Macmillan, 2014. – P. 83–95.</w:t>
+      </w:r>
+    </w:p>
+  </w:footnote>
+  <w:footnote w:id="68">
+    <w:p>
+      <w:pPr>
+        <w:pStyle w:val="FootnoteText"/>
+      </w:pPr>
+      <w:r>
+        <w:rPr>
+          <w:rStyle w:val="FootnoteReference"/>
+        </w:rPr>
+        <w:footnoteRef/>
+      </w:r>
+      <w:r>
+        <w:t xml:space="preserve"> </w:t>
+      </w:r>
+      <w:r>
+        <w:t xml:space="preserve">Borio C. Towards a Macroprudential Framework for Financial Supervision and Regulation?: BIS Working Papers No. 128. – Basel: Bank for International Settlements, 2003. – 32 p.</w:t>
+      </w:r>
+    </w:p>
+  </w:footnote>
+  <w:footnote w:id="69">
+    <w:p>
+      <w:pPr>
+        <w:pStyle w:val="FootnoteText"/>
+      </w:pPr>
+      <w:r>
+        <w:rPr>
+          <w:rStyle w:val="FootnoteReference"/>
+        </w:rPr>
+        <w:footnoteRef/>
+      </w:r>
+      <w:r>
+        <w:t xml:space="preserve"> </w:t>
+      </w:r>
+      <w:r>
+        <w:t xml:space="preserve">Adrian T., Brunnermeier M.K. CoVaR // American Economic Review. – 2016. – Vol. 106, No. 7. – P. 1705–1741.</w:t>
+      </w:r>
+    </w:p>
+  </w:footnote>
+  <w:footnote w:id="70">
+    <w:p>
+      <w:pPr>
+        <w:pStyle w:val="FootnoteText"/>
+      </w:pPr>
+      <w:r>
+        <w:rPr>
+          <w:rStyle w:val="FootnoteReference"/>
+        </w:rPr>
+        <w:footnoteRef/>
+      </w:r>
+      <w:r>
+        <w:t xml:space="preserve"> </w:t>
+      </w:r>
+      <w:r>
+        <w:t xml:space="preserve">Регулирование банковской сферы: учебник / под ред. О.Н. Афанасьевой, С.Е. Дубовой. – М.: КНОРУС. – С. 55–62.</w:t>
+      </w:r>
+    </w:p>
+  </w:footnote>
+  <w:footnote w:id="71">
+    <w:p>
+      <w:pPr>
+        <w:pStyle w:val="FootnoteText"/>
+      </w:pPr>
+      <w:r>
+        <w:rPr>
+          <w:rStyle w:val="FootnoteReference"/>
+        </w:rPr>
+        <w:footnoteRef/>
+      </w:r>
+      <w:r>
+        <w:t xml:space="preserve"> </w:t>
+      </w:r>
+      <w:r>
+        <w:t xml:space="preserve">IFRS 9 Financial Instruments. – London: International Accounting Standards Board, 2014.</w:t>
+      </w:r>
+    </w:p>
+  </w:footnote>
+  <w:footnote w:id="72">
+    <w:p>
+      <w:pPr>
+        <w:pStyle w:val="FootnoteText"/>
+      </w:pPr>
+      <w:r>
+        <w:rPr>
+          <w:rStyle w:val="FootnoteReference"/>
+        </w:rPr>
+        <w:footnoteRef/>
+      </w:r>
+      <w:r>
+        <w:t xml:space="preserve"> </w:t>
+      </w:r>
+      <w:r>
+        <w:t xml:space="preserve">Tadqiqot natijasida muallif tomonidan quyidagi manbalar asosida ishlab chiqildi: Diamond D.W., Dybvig P.H. Bank Runs, Deposit Insurance, and Liquidity // Journal of Political Economy. – 1983. – Vol. 91, No. 3. – P. 401–419; Minsky H.P. The Financial Instability Hypothesis: Working Paper No. 74. – Annandale-on-Hudson: The Jerome Levy Economics Institute of Bard College, 1992. – 10 p; Tarullo D.K. Banking on Basel: The Future of International Financial Regulation. – Washington, DC: Peterson Institute for International Economics, 2008. – P. 16; Merton R.C. On the Pricing of Corporate Debt: The Risk Structure of Interest Rates // Journal of Finance. – 1974. – Vol. 29, No. 2. – P. 449–470; Boyd J.H., Graham S.L. Risk, Regulation, and Bank Holding Company Expansion into Nonbanking // Federal Reserve Bank of Minneapolis Quarterly Review. – 1986. – Vol. 10, No. 2. – P. 2–17; Borio C. Towards a Macroprudential Framework for Financial Supervision and Regulation?: BIS Working Papers No. 128. – Basel: Bank for International Settlements, 2003. – 32 p; Adrian T., Brunnermeier M.K. CoVaR // American Economic Review. – 2016. – Vol. 106, No. 7. – P. 1705–1741; IFRS 9 Financial Instruments. – London: International Accounting Standards Board, 2014.</w:t>
+      </w:r>
+    </w:p>
+  </w:footnote>
+  <w:footnote w:id="73">
     <w:p>
       <w:pPr>
         <w:pStyle w:val="FootnoteText"/>

</xml_diff>